<commit_message>
begin ov avk pravki
</commit_message>
<xml_diff>
--- a/burocracy/second_submission/Astapenko_ostapiv.docx
+++ b/burocracy/second_submission/Astapenko_ostapiv.docx
@@ -109,13 +109,23 @@
           <w:szCs w:val="24"/>
         </w:rPr>
       </w:pPr>
-      <w:r>
-        <w:rPr>
-          <w:rFonts w:ascii="Times New Roman" w:hAnsi="Times New Roman" w:cs="Times New Roman"/>
-          <w:sz w:val="24"/>
-          <w:szCs w:val="24"/>
-        </w:rPr>
-        <w:t>Кведеру Виталию Владимировичу</w:t>
+      <w:proofErr w:type="spellStart"/>
+      <w:r>
+        <w:rPr>
+          <w:rFonts w:ascii="Times New Roman" w:hAnsi="Times New Roman" w:cs="Times New Roman"/>
+          <w:sz w:val="24"/>
+          <w:szCs w:val="24"/>
+        </w:rPr>
+        <w:t>Кведеру</w:t>
+      </w:r>
+      <w:proofErr w:type="spellEnd"/>
+      <w:r>
+        <w:rPr>
+          <w:rFonts w:ascii="Times New Roman" w:hAnsi="Times New Roman" w:cs="Times New Roman"/>
+          <w:sz w:val="24"/>
+          <w:szCs w:val="24"/>
+        </w:rPr>
+        <w:t xml:space="preserve"> Виталию Владимировичу</w:t>
       </w:r>
     </w:p>
     <w:p>
@@ -215,6 +225,7 @@
         </w:rPr>
         <w:t xml:space="preserve"> 1.3.19 </w:t>
       </w:r>
+      <w:proofErr w:type="spellStart"/>
       <w:r>
         <w:rPr>
           <w:rFonts w:ascii="Times New Roman" w:hAnsi="Times New Roman" w:cs="Times New Roman"/>
@@ -222,7 +233,37 @@
           <w:szCs w:val="24"/>
           <w:lang w:val="uk-UA"/>
         </w:rPr>
-        <w:t>Лазерная физика.</w:t>
+        <w:t>Лазерная</w:t>
+      </w:r>
+      <w:proofErr w:type="spellEnd"/>
+      <w:r>
+        <w:rPr>
+          <w:rFonts w:ascii="Times New Roman" w:hAnsi="Times New Roman" w:cs="Times New Roman"/>
+          <w:sz w:val="24"/>
+          <w:szCs w:val="24"/>
+          <w:lang w:val="uk-UA"/>
+        </w:rPr>
+        <w:t xml:space="preserve"> </w:t>
+      </w:r>
+      <w:proofErr w:type="spellStart"/>
+      <w:r>
+        <w:rPr>
+          <w:rFonts w:ascii="Times New Roman" w:hAnsi="Times New Roman" w:cs="Times New Roman"/>
+          <w:sz w:val="24"/>
+          <w:szCs w:val="24"/>
+          <w:lang w:val="uk-UA"/>
+        </w:rPr>
+        <w:t>физика</w:t>
+      </w:r>
+      <w:proofErr w:type="spellEnd"/>
+      <w:r>
+        <w:rPr>
+          <w:rFonts w:ascii="Times New Roman" w:hAnsi="Times New Roman" w:cs="Times New Roman"/>
+          <w:sz w:val="24"/>
+          <w:szCs w:val="24"/>
+          <w:lang w:val="uk-UA"/>
+        </w:rPr>
+        <w:t>.</w:t>
       </w:r>
     </w:p>
     <w:p>
@@ -389,8 +430,18 @@
           <w:sz w:val="24"/>
           <w:szCs w:val="24"/>
         </w:rPr>
-        <w:t>Астапенко В.А.</w:t>
-      </w:r>
+        <w:t xml:space="preserve">Астапенко </w:t>
+      </w:r>
+      <w:proofErr w:type="gramStart"/>
+      <w:r>
+        <w:rPr>
+          <w:rFonts w:ascii="Times New Roman" w:hAnsi="Times New Roman" w:cs="Times New Roman"/>
+          <w:sz w:val="24"/>
+          <w:szCs w:val="24"/>
+        </w:rPr>
+        <w:t>В.А.</w:t>
+      </w:r>
+      <w:proofErr w:type="gramEnd"/>
       <w:r>
         <w:rPr>
           <w:rFonts w:ascii="Times New Roman" w:hAnsi="Times New Roman" w:cs="Times New Roman"/>
@@ -840,6 +891,7 @@
         <w:spacing w:before="1"/>
         <w:ind w:left="118"/>
         <w:rPr>
+          <w:spacing w:val="-2"/>
           <w:lang w:val="ru-RU"/>
         </w:rPr>
       </w:pPr>
@@ -869,6 +921,66 @@
         </w:rPr>
         <w:t xml:space="preserve"> 09.09.1959</w:t>
       </w:r>
+    </w:p>
+    <w:p>
+      <w:pPr>
+        <w:pStyle w:val="a5"/>
+        <w:spacing w:before="1"/>
+        <w:ind w:left="118"/>
+        <w:rPr>
+          <w:spacing w:val="-2"/>
+        </w:rPr>
+      </w:pPr>
+    </w:p>
+    <w:p>
+      <w:pPr>
+        <w:pStyle w:val="a5"/>
+        <w:spacing w:before="1"/>
+        <w:ind w:left="118"/>
+        <w:rPr>
+          <w:lang w:val="ru-RU"/>
+        </w:rPr>
+      </w:pPr>
+      <w:r>
+        <w:rPr>
+          <w:spacing w:val="-2"/>
+          <w:lang w:val="ru-RU"/>
+        </w:rPr>
+        <w:t xml:space="preserve">Контактные данные: </w:t>
+      </w:r>
+      <w:hyperlink r:id="rId5" w:history="1">
+        <w:r>
+          <w:rPr>
+            <w:rStyle w:val="a7"/>
+            <w:spacing w:val="-2"/>
+            <w:lang w:val="ru-RU"/>
+          </w:rPr>
+          <w:t>astval@mail.ru</w:t>
+        </w:r>
+      </w:hyperlink>
+      <w:r>
+        <w:rPr>
+          <w:spacing w:val="-2"/>
+          <w:lang w:val="ru-RU"/>
+        </w:rPr>
+        <w:t xml:space="preserve"> </w:t>
+      </w:r>
+      <w:r>
+        <w:rPr>
+          <w:spacing w:val="-2"/>
+          <w:lang w:val="ru-RU"/>
+        </w:rPr>
+        <w:t>+7(962)993-</w:t>
+      </w:r>
+      <w:proofErr w:type="gramStart"/>
+      <w:r>
+        <w:rPr>
+          <w:spacing w:val="-2"/>
+          <w:lang w:val="ru-RU"/>
+        </w:rPr>
+        <w:t>89-04</w:t>
+      </w:r>
+      <w:proofErr w:type="gramEnd"/>
     </w:p>
     <w:p>
       <w:pPr>
@@ -929,7 +1041,25 @@
           <w:i/>
           <w:sz w:val="24"/>
         </w:rPr>
-        <w:t>(библиографическая ссылка с указанием квартиля/категории и импакт-фактора журнала, базы данных и DOI)</w:t>
+        <w:t xml:space="preserve">(библиографическая ссылка с указанием квартиля/категории и </w:t>
+      </w:r>
+      <w:proofErr w:type="spellStart"/>
+      <w:r>
+        <w:rPr>
+          <w:rFonts w:ascii="Times New Roman" w:hAnsi="Times New Roman" w:cs="Times New Roman"/>
+          <w:i/>
+          <w:sz w:val="24"/>
+        </w:rPr>
+        <w:t>импакт</w:t>
+      </w:r>
+      <w:proofErr w:type="spellEnd"/>
+      <w:r>
+        <w:rPr>
+          <w:rFonts w:ascii="Times New Roman" w:hAnsi="Times New Roman" w:cs="Times New Roman"/>
+          <w:i/>
+          <w:sz w:val="24"/>
+        </w:rPr>
+        <w:t>-фактора журнала, базы данных и DOI)</w:t>
       </w:r>
     </w:p>
     <w:p>
@@ -945,12 +1075,197 @@
           <w:sz w:val="24"/>
         </w:rPr>
       </w:pPr>
-      <w:r>
-        <w:rPr>
-          <w:rFonts w:ascii="Times New Roman" w:hAnsi="Times New Roman" w:cs="Times New Roman"/>
-          <w:sz w:val="24"/>
-        </w:rPr>
-        <w:t>Astapenko V. A., Bergaliev T. K. Excitation of quantum oscillator by electromagnetic wavelet pulses // Journal of Optics. – 2023. – V. 25. – No. 11. – P. 115502. DOI: 10.1088/2040-8986/acff09</w:t>
+      <w:proofErr w:type="spellStart"/>
+      <w:r>
+        <w:rPr>
+          <w:rFonts w:ascii="Times New Roman" w:hAnsi="Times New Roman" w:cs="Times New Roman"/>
+          <w:sz w:val="24"/>
+        </w:rPr>
+        <w:t>Astapenko</w:t>
+      </w:r>
+      <w:proofErr w:type="spellEnd"/>
+      <w:r>
+        <w:rPr>
+          <w:rFonts w:ascii="Times New Roman" w:hAnsi="Times New Roman" w:cs="Times New Roman"/>
+          <w:sz w:val="24"/>
+        </w:rPr>
+        <w:t xml:space="preserve"> V. A., </w:t>
+      </w:r>
+      <w:proofErr w:type="spellStart"/>
+      <w:r>
+        <w:rPr>
+          <w:rFonts w:ascii="Times New Roman" w:hAnsi="Times New Roman" w:cs="Times New Roman"/>
+          <w:sz w:val="24"/>
+        </w:rPr>
+        <w:t>Bergaliev</w:t>
+      </w:r>
+      <w:proofErr w:type="spellEnd"/>
+      <w:r>
+        <w:rPr>
+          <w:rFonts w:ascii="Times New Roman" w:hAnsi="Times New Roman" w:cs="Times New Roman"/>
+          <w:sz w:val="24"/>
+        </w:rPr>
+        <w:t xml:space="preserve"> T. K. </w:t>
+      </w:r>
+      <w:proofErr w:type="spellStart"/>
+      <w:r>
+        <w:rPr>
+          <w:rFonts w:ascii="Times New Roman" w:hAnsi="Times New Roman" w:cs="Times New Roman"/>
+          <w:sz w:val="24"/>
+        </w:rPr>
+        <w:t>Excitation</w:t>
+      </w:r>
+      <w:proofErr w:type="spellEnd"/>
+      <w:r>
+        <w:rPr>
+          <w:rFonts w:ascii="Times New Roman" w:hAnsi="Times New Roman" w:cs="Times New Roman"/>
+          <w:sz w:val="24"/>
+        </w:rPr>
+        <w:t xml:space="preserve"> </w:t>
+      </w:r>
+      <w:proofErr w:type="spellStart"/>
+      <w:r>
+        <w:rPr>
+          <w:rFonts w:ascii="Times New Roman" w:hAnsi="Times New Roman" w:cs="Times New Roman"/>
+          <w:sz w:val="24"/>
+        </w:rPr>
+        <w:t>of</w:t>
+      </w:r>
+      <w:proofErr w:type="spellEnd"/>
+      <w:r>
+        <w:rPr>
+          <w:rFonts w:ascii="Times New Roman" w:hAnsi="Times New Roman" w:cs="Times New Roman"/>
+          <w:sz w:val="24"/>
+        </w:rPr>
+        <w:t xml:space="preserve"> </w:t>
+      </w:r>
+      <w:proofErr w:type="spellStart"/>
+      <w:r>
+        <w:rPr>
+          <w:rFonts w:ascii="Times New Roman" w:hAnsi="Times New Roman" w:cs="Times New Roman"/>
+          <w:sz w:val="24"/>
+        </w:rPr>
+        <w:t>quantum</w:t>
+      </w:r>
+      <w:proofErr w:type="spellEnd"/>
+      <w:r>
+        <w:rPr>
+          <w:rFonts w:ascii="Times New Roman" w:hAnsi="Times New Roman" w:cs="Times New Roman"/>
+          <w:sz w:val="24"/>
+        </w:rPr>
+        <w:t xml:space="preserve"> </w:t>
+      </w:r>
+      <w:proofErr w:type="spellStart"/>
+      <w:r>
+        <w:rPr>
+          <w:rFonts w:ascii="Times New Roman" w:hAnsi="Times New Roman" w:cs="Times New Roman"/>
+          <w:sz w:val="24"/>
+        </w:rPr>
+        <w:t>oscillator</w:t>
+      </w:r>
+      <w:proofErr w:type="spellEnd"/>
+      <w:r>
+        <w:rPr>
+          <w:rFonts w:ascii="Times New Roman" w:hAnsi="Times New Roman" w:cs="Times New Roman"/>
+          <w:sz w:val="24"/>
+        </w:rPr>
+        <w:t xml:space="preserve"> </w:t>
+      </w:r>
+      <w:proofErr w:type="spellStart"/>
+      <w:r>
+        <w:rPr>
+          <w:rFonts w:ascii="Times New Roman" w:hAnsi="Times New Roman" w:cs="Times New Roman"/>
+          <w:sz w:val="24"/>
+        </w:rPr>
+        <w:t>by</w:t>
+      </w:r>
+      <w:proofErr w:type="spellEnd"/>
+      <w:r>
+        <w:rPr>
+          <w:rFonts w:ascii="Times New Roman" w:hAnsi="Times New Roman" w:cs="Times New Roman"/>
+          <w:sz w:val="24"/>
+        </w:rPr>
+        <w:t xml:space="preserve"> </w:t>
+      </w:r>
+      <w:proofErr w:type="spellStart"/>
+      <w:r>
+        <w:rPr>
+          <w:rFonts w:ascii="Times New Roman" w:hAnsi="Times New Roman" w:cs="Times New Roman"/>
+          <w:sz w:val="24"/>
+        </w:rPr>
+        <w:t>electromagnetic</w:t>
+      </w:r>
+      <w:proofErr w:type="spellEnd"/>
+      <w:r>
+        <w:rPr>
+          <w:rFonts w:ascii="Times New Roman" w:hAnsi="Times New Roman" w:cs="Times New Roman"/>
+          <w:sz w:val="24"/>
+        </w:rPr>
+        <w:t xml:space="preserve"> </w:t>
+      </w:r>
+      <w:proofErr w:type="spellStart"/>
+      <w:r>
+        <w:rPr>
+          <w:rFonts w:ascii="Times New Roman" w:hAnsi="Times New Roman" w:cs="Times New Roman"/>
+          <w:sz w:val="24"/>
+        </w:rPr>
+        <w:t>wavelet</w:t>
+      </w:r>
+      <w:proofErr w:type="spellEnd"/>
+      <w:r>
+        <w:rPr>
+          <w:rFonts w:ascii="Times New Roman" w:hAnsi="Times New Roman" w:cs="Times New Roman"/>
+          <w:sz w:val="24"/>
+        </w:rPr>
+        <w:t xml:space="preserve"> </w:t>
+      </w:r>
+      <w:proofErr w:type="spellStart"/>
+      <w:r>
+        <w:rPr>
+          <w:rFonts w:ascii="Times New Roman" w:hAnsi="Times New Roman" w:cs="Times New Roman"/>
+          <w:sz w:val="24"/>
+        </w:rPr>
+        <w:t>pulses</w:t>
+      </w:r>
+      <w:proofErr w:type="spellEnd"/>
+      <w:r>
+        <w:rPr>
+          <w:rFonts w:ascii="Times New Roman" w:hAnsi="Times New Roman" w:cs="Times New Roman"/>
+          <w:sz w:val="24"/>
+        </w:rPr>
+        <w:t xml:space="preserve"> // Journal </w:t>
+      </w:r>
+      <w:proofErr w:type="spellStart"/>
+      <w:r>
+        <w:rPr>
+          <w:rFonts w:ascii="Times New Roman" w:hAnsi="Times New Roman" w:cs="Times New Roman"/>
+          <w:sz w:val="24"/>
+        </w:rPr>
+        <w:t>of</w:t>
+      </w:r>
+      <w:proofErr w:type="spellEnd"/>
+      <w:r>
+        <w:rPr>
+          <w:rFonts w:ascii="Times New Roman" w:hAnsi="Times New Roman" w:cs="Times New Roman"/>
+          <w:sz w:val="24"/>
+        </w:rPr>
+        <w:t xml:space="preserve"> Optics. – 2023. – V. 25. – No. 11. – P. 115502. DOI: 10.1088/</w:t>
+      </w:r>
+      <w:proofErr w:type="gramStart"/>
+      <w:r>
+        <w:rPr>
+          <w:rFonts w:ascii="Times New Roman" w:hAnsi="Times New Roman" w:cs="Times New Roman"/>
+          <w:sz w:val="24"/>
+        </w:rPr>
+        <w:t>2040-8986</w:t>
+      </w:r>
+      <w:proofErr w:type="gramEnd"/>
+      <w:r>
+        <w:rPr>
+          <w:rFonts w:ascii="Times New Roman" w:hAnsi="Times New Roman" w:cs="Times New Roman"/>
+          <w:sz w:val="24"/>
+        </w:rPr>
+        <w:t>/acff09</w:t>
       </w:r>
     </w:p>
     <w:p>
@@ -966,12 +1281,197 @@
           <w:sz w:val="24"/>
         </w:rPr>
       </w:pPr>
-      <w:r>
-        <w:rPr>
-          <w:rFonts w:ascii="Times New Roman" w:hAnsi="Times New Roman" w:cs="Times New Roman"/>
-          <w:sz w:val="24"/>
-        </w:rPr>
-        <w:t xml:space="preserve">Astapenko V. A., Sakhno E. V., Sakhno S. V. Energy transfer from ultra-short laser pulse to quantum oscillator in thermal equilibrium //Applied Physics B. – 2026. – </w:t>
+      <w:proofErr w:type="spellStart"/>
+      <w:r>
+        <w:rPr>
+          <w:rFonts w:ascii="Times New Roman" w:hAnsi="Times New Roman" w:cs="Times New Roman"/>
+          <w:sz w:val="24"/>
+        </w:rPr>
+        <w:t>Astapenko</w:t>
+      </w:r>
+      <w:proofErr w:type="spellEnd"/>
+      <w:r>
+        <w:rPr>
+          <w:rFonts w:ascii="Times New Roman" w:hAnsi="Times New Roman" w:cs="Times New Roman"/>
+          <w:sz w:val="24"/>
+        </w:rPr>
+        <w:t xml:space="preserve"> V. A., </w:t>
+      </w:r>
+      <w:proofErr w:type="spellStart"/>
+      <w:r>
+        <w:rPr>
+          <w:rFonts w:ascii="Times New Roman" w:hAnsi="Times New Roman" w:cs="Times New Roman"/>
+          <w:sz w:val="24"/>
+        </w:rPr>
+        <w:t>Sakhno</w:t>
+      </w:r>
+      <w:proofErr w:type="spellEnd"/>
+      <w:r>
+        <w:rPr>
+          <w:rFonts w:ascii="Times New Roman" w:hAnsi="Times New Roman" w:cs="Times New Roman"/>
+          <w:sz w:val="24"/>
+        </w:rPr>
+        <w:t xml:space="preserve"> E. V., </w:t>
+      </w:r>
+      <w:proofErr w:type="spellStart"/>
+      <w:r>
+        <w:rPr>
+          <w:rFonts w:ascii="Times New Roman" w:hAnsi="Times New Roman" w:cs="Times New Roman"/>
+          <w:sz w:val="24"/>
+        </w:rPr>
+        <w:t>Sakhno</w:t>
+      </w:r>
+      <w:proofErr w:type="spellEnd"/>
+      <w:r>
+        <w:rPr>
+          <w:rFonts w:ascii="Times New Roman" w:hAnsi="Times New Roman" w:cs="Times New Roman"/>
+          <w:sz w:val="24"/>
+        </w:rPr>
+        <w:t xml:space="preserve"> S. V. Energy </w:t>
+      </w:r>
+      <w:proofErr w:type="spellStart"/>
+      <w:r>
+        <w:rPr>
+          <w:rFonts w:ascii="Times New Roman" w:hAnsi="Times New Roman" w:cs="Times New Roman"/>
+          <w:sz w:val="24"/>
+        </w:rPr>
+        <w:t>transfer</w:t>
+      </w:r>
+      <w:proofErr w:type="spellEnd"/>
+      <w:r>
+        <w:rPr>
+          <w:rFonts w:ascii="Times New Roman" w:hAnsi="Times New Roman" w:cs="Times New Roman"/>
+          <w:sz w:val="24"/>
+        </w:rPr>
+        <w:t xml:space="preserve"> </w:t>
+      </w:r>
+      <w:proofErr w:type="spellStart"/>
+      <w:r>
+        <w:rPr>
+          <w:rFonts w:ascii="Times New Roman" w:hAnsi="Times New Roman" w:cs="Times New Roman"/>
+          <w:sz w:val="24"/>
+        </w:rPr>
+        <w:t>from</w:t>
+      </w:r>
+      <w:proofErr w:type="spellEnd"/>
+      <w:r>
+        <w:rPr>
+          <w:rFonts w:ascii="Times New Roman" w:hAnsi="Times New Roman" w:cs="Times New Roman"/>
+          <w:sz w:val="24"/>
+        </w:rPr>
+        <w:t xml:space="preserve"> </w:t>
+      </w:r>
+      <w:proofErr w:type="spellStart"/>
+      <w:r>
+        <w:rPr>
+          <w:rFonts w:ascii="Times New Roman" w:hAnsi="Times New Roman" w:cs="Times New Roman"/>
+          <w:sz w:val="24"/>
+        </w:rPr>
+        <w:t>ultra-short</w:t>
+      </w:r>
+      <w:proofErr w:type="spellEnd"/>
+      <w:r>
+        <w:rPr>
+          <w:rFonts w:ascii="Times New Roman" w:hAnsi="Times New Roman" w:cs="Times New Roman"/>
+          <w:sz w:val="24"/>
+        </w:rPr>
+        <w:t xml:space="preserve"> laser </w:t>
+      </w:r>
+      <w:proofErr w:type="spellStart"/>
+      <w:r>
+        <w:rPr>
+          <w:rFonts w:ascii="Times New Roman" w:hAnsi="Times New Roman" w:cs="Times New Roman"/>
+          <w:sz w:val="24"/>
+        </w:rPr>
+        <w:t>pulse</w:t>
+      </w:r>
+      <w:proofErr w:type="spellEnd"/>
+      <w:r>
+        <w:rPr>
+          <w:rFonts w:ascii="Times New Roman" w:hAnsi="Times New Roman" w:cs="Times New Roman"/>
+          <w:sz w:val="24"/>
+        </w:rPr>
+        <w:t xml:space="preserve"> </w:t>
+      </w:r>
+      <w:proofErr w:type="spellStart"/>
+      <w:r>
+        <w:rPr>
+          <w:rFonts w:ascii="Times New Roman" w:hAnsi="Times New Roman" w:cs="Times New Roman"/>
+          <w:sz w:val="24"/>
+        </w:rPr>
+        <w:t>to</w:t>
+      </w:r>
+      <w:proofErr w:type="spellEnd"/>
+      <w:r>
+        <w:rPr>
+          <w:rFonts w:ascii="Times New Roman" w:hAnsi="Times New Roman" w:cs="Times New Roman"/>
+          <w:sz w:val="24"/>
+        </w:rPr>
+        <w:t xml:space="preserve"> </w:t>
+      </w:r>
+      <w:proofErr w:type="spellStart"/>
+      <w:r>
+        <w:rPr>
+          <w:rFonts w:ascii="Times New Roman" w:hAnsi="Times New Roman" w:cs="Times New Roman"/>
+          <w:sz w:val="24"/>
+        </w:rPr>
+        <w:t>quantum</w:t>
+      </w:r>
+      <w:proofErr w:type="spellEnd"/>
+      <w:r>
+        <w:rPr>
+          <w:rFonts w:ascii="Times New Roman" w:hAnsi="Times New Roman" w:cs="Times New Roman"/>
+          <w:sz w:val="24"/>
+        </w:rPr>
+        <w:t xml:space="preserve"> </w:t>
+      </w:r>
+      <w:proofErr w:type="spellStart"/>
+      <w:r>
+        <w:rPr>
+          <w:rFonts w:ascii="Times New Roman" w:hAnsi="Times New Roman" w:cs="Times New Roman"/>
+          <w:sz w:val="24"/>
+        </w:rPr>
+        <w:t>oscillator</w:t>
+      </w:r>
+      <w:proofErr w:type="spellEnd"/>
+      <w:r>
+        <w:rPr>
+          <w:rFonts w:ascii="Times New Roman" w:hAnsi="Times New Roman" w:cs="Times New Roman"/>
+          <w:sz w:val="24"/>
+        </w:rPr>
+        <w:t xml:space="preserve"> in </w:t>
+      </w:r>
+      <w:proofErr w:type="spellStart"/>
+      <w:r>
+        <w:rPr>
+          <w:rFonts w:ascii="Times New Roman" w:hAnsi="Times New Roman" w:cs="Times New Roman"/>
+          <w:sz w:val="24"/>
+        </w:rPr>
+        <w:t>thermal</w:t>
+      </w:r>
+      <w:proofErr w:type="spellEnd"/>
+      <w:r>
+        <w:rPr>
+          <w:rFonts w:ascii="Times New Roman" w:hAnsi="Times New Roman" w:cs="Times New Roman"/>
+          <w:sz w:val="24"/>
+        </w:rPr>
+        <w:t xml:space="preserve"> </w:t>
+      </w:r>
+      <w:proofErr w:type="spellStart"/>
+      <w:r>
+        <w:rPr>
+          <w:rFonts w:ascii="Times New Roman" w:hAnsi="Times New Roman" w:cs="Times New Roman"/>
+          <w:sz w:val="24"/>
+        </w:rPr>
+        <w:t>equilibrium</w:t>
+      </w:r>
+      <w:proofErr w:type="spellEnd"/>
+      <w:r>
+        <w:rPr>
+          <w:rFonts w:ascii="Times New Roman" w:hAnsi="Times New Roman" w:cs="Times New Roman"/>
+          <w:sz w:val="24"/>
+        </w:rPr>
+        <w:t xml:space="preserve"> //Applied Physics B. – 2026. – </w:t>
       </w:r>
       <w:r>
         <w:rPr>
@@ -1048,12 +1548,277 @@
           <w:sz w:val="24"/>
         </w:rPr>
       </w:pPr>
-      <w:r>
-        <w:rPr>
-          <w:rFonts w:ascii="Times New Roman" w:hAnsi="Times New Roman" w:cs="Times New Roman"/>
-          <w:sz w:val="24"/>
-        </w:rPr>
-        <w:t>Rosmej F. B., Astapenko V. A., Li X. Short-pulse electromagnetic scattering on near-solid-density matter: Description of closed analytical expressions including opacity // Matter and Radiation at Extremes. – 2026. – V. 11. – No. 3. DOI: 10.1063/5.0315205</w:t>
+      <w:proofErr w:type="spellStart"/>
+      <w:r>
+        <w:rPr>
+          <w:rFonts w:ascii="Times New Roman" w:hAnsi="Times New Roman" w:cs="Times New Roman"/>
+          <w:sz w:val="24"/>
+        </w:rPr>
+        <w:t>Rosmej</w:t>
+      </w:r>
+      <w:proofErr w:type="spellEnd"/>
+      <w:r>
+        <w:rPr>
+          <w:rFonts w:ascii="Times New Roman" w:hAnsi="Times New Roman" w:cs="Times New Roman"/>
+          <w:sz w:val="24"/>
+        </w:rPr>
+        <w:t xml:space="preserve"> F. B., </w:t>
+      </w:r>
+      <w:proofErr w:type="spellStart"/>
+      <w:r>
+        <w:rPr>
+          <w:rFonts w:ascii="Times New Roman" w:hAnsi="Times New Roman" w:cs="Times New Roman"/>
+          <w:sz w:val="24"/>
+        </w:rPr>
+        <w:t>Astapenko</w:t>
+      </w:r>
+      <w:proofErr w:type="spellEnd"/>
+      <w:r>
+        <w:rPr>
+          <w:rFonts w:ascii="Times New Roman" w:hAnsi="Times New Roman" w:cs="Times New Roman"/>
+          <w:sz w:val="24"/>
+        </w:rPr>
+        <w:t xml:space="preserve"> V. A., Li X. </w:t>
+      </w:r>
+      <w:proofErr w:type="spellStart"/>
+      <w:r>
+        <w:rPr>
+          <w:rFonts w:ascii="Times New Roman" w:hAnsi="Times New Roman" w:cs="Times New Roman"/>
+          <w:sz w:val="24"/>
+        </w:rPr>
+        <w:t>Short-pulse</w:t>
+      </w:r>
+      <w:proofErr w:type="spellEnd"/>
+      <w:r>
+        <w:rPr>
+          <w:rFonts w:ascii="Times New Roman" w:hAnsi="Times New Roman" w:cs="Times New Roman"/>
+          <w:sz w:val="24"/>
+        </w:rPr>
+        <w:t xml:space="preserve"> </w:t>
+      </w:r>
+      <w:proofErr w:type="spellStart"/>
+      <w:r>
+        <w:rPr>
+          <w:rFonts w:ascii="Times New Roman" w:hAnsi="Times New Roman" w:cs="Times New Roman"/>
+          <w:sz w:val="24"/>
+        </w:rPr>
+        <w:t>electromagnetic</w:t>
+      </w:r>
+      <w:proofErr w:type="spellEnd"/>
+      <w:r>
+        <w:rPr>
+          <w:rFonts w:ascii="Times New Roman" w:hAnsi="Times New Roman" w:cs="Times New Roman"/>
+          <w:sz w:val="24"/>
+        </w:rPr>
+        <w:t xml:space="preserve"> </w:t>
+      </w:r>
+      <w:proofErr w:type="spellStart"/>
+      <w:r>
+        <w:rPr>
+          <w:rFonts w:ascii="Times New Roman" w:hAnsi="Times New Roman" w:cs="Times New Roman"/>
+          <w:sz w:val="24"/>
+        </w:rPr>
+        <w:t>scattering</w:t>
+      </w:r>
+      <w:proofErr w:type="spellEnd"/>
+      <w:r>
+        <w:rPr>
+          <w:rFonts w:ascii="Times New Roman" w:hAnsi="Times New Roman" w:cs="Times New Roman"/>
+          <w:sz w:val="24"/>
+        </w:rPr>
+        <w:t xml:space="preserve"> on </w:t>
+      </w:r>
+      <w:proofErr w:type="spellStart"/>
+      <w:r>
+        <w:rPr>
+          <w:rFonts w:ascii="Times New Roman" w:hAnsi="Times New Roman" w:cs="Times New Roman"/>
+          <w:sz w:val="24"/>
+        </w:rPr>
+        <w:t>near-solid-density</w:t>
+      </w:r>
+      <w:proofErr w:type="spellEnd"/>
+      <w:r>
+        <w:rPr>
+          <w:rFonts w:ascii="Times New Roman" w:hAnsi="Times New Roman" w:cs="Times New Roman"/>
+          <w:sz w:val="24"/>
+        </w:rPr>
+        <w:t xml:space="preserve"> </w:t>
+      </w:r>
+      <w:proofErr w:type="spellStart"/>
+      <w:r>
+        <w:rPr>
+          <w:rFonts w:ascii="Times New Roman" w:hAnsi="Times New Roman" w:cs="Times New Roman"/>
+          <w:sz w:val="24"/>
+        </w:rPr>
+        <w:t>matter</w:t>
+      </w:r>
+      <w:proofErr w:type="spellEnd"/>
+      <w:r>
+        <w:rPr>
+          <w:rFonts w:ascii="Times New Roman" w:hAnsi="Times New Roman" w:cs="Times New Roman"/>
+          <w:sz w:val="24"/>
+        </w:rPr>
+        <w:t xml:space="preserve">: </w:t>
+      </w:r>
+      <w:proofErr w:type="spellStart"/>
+      <w:r>
+        <w:rPr>
+          <w:rFonts w:ascii="Times New Roman" w:hAnsi="Times New Roman" w:cs="Times New Roman"/>
+          <w:sz w:val="24"/>
+        </w:rPr>
+        <w:t>Description</w:t>
+      </w:r>
+      <w:proofErr w:type="spellEnd"/>
+      <w:r>
+        <w:rPr>
+          <w:rFonts w:ascii="Times New Roman" w:hAnsi="Times New Roman" w:cs="Times New Roman"/>
+          <w:sz w:val="24"/>
+        </w:rPr>
+        <w:t xml:space="preserve"> </w:t>
+      </w:r>
+      <w:proofErr w:type="spellStart"/>
+      <w:r>
+        <w:rPr>
+          <w:rFonts w:ascii="Times New Roman" w:hAnsi="Times New Roman" w:cs="Times New Roman"/>
+          <w:sz w:val="24"/>
+        </w:rPr>
+        <w:t>of</w:t>
+      </w:r>
+      <w:proofErr w:type="spellEnd"/>
+      <w:r>
+        <w:rPr>
+          <w:rFonts w:ascii="Times New Roman" w:hAnsi="Times New Roman" w:cs="Times New Roman"/>
+          <w:sz w:val="24"/>
+        </w:rPr>
+        <w:t xml:space="preserve"> </w:t>
+      </w:r>
+      <w:proofErr w:type="spellStart"/>
+      <w:r>
+        <w:rPr>
+          <w:rFonts w:ascii="Times New Roman" w:hAnsi="Times New Roman" w:cs="Times New Roman"/>
+          <w:sz w:val="24"/>
+        </w:rPr>
+        <w:t>closed</w:t>
+      </w:r>
+      <w:proofErr w:type="spellEnd"/>
+      <w:r>
+        <w:rPr>
+          <w:rFonts w:ascii="Times New Roman" w:hAnsi="Times New Roman" w:cs="Times New Roman"/>
+          <w:sz w:val="24"/>
+        </w:rPr>
+        <w:t xml:space="preserve"> </w:t>
+      </w:r>
+      <w:proofErr w:type="spellStart"/>
+      <w:r>
+        <w:rPr>
+          <w:rFonts w:ascii="Times New Roman" w:hAnsi="Times New Roman" w:cs="Times New Roman"/>
+          <w:sz w:val="24"/>
+        </w:rPr>
+        <w:t>analytical</w:t>
+      </w:r>
+      <w:proofErr w:type="spellEnd"/>
+      <w:r>
+        <w:rPr>
+          <w:rFonts w:ascii="Times New Roman" w:hAnsi="Times New Roman" w:cs="Times New Roman"/>
+          <w:sz w:val="24"/>
+        </w:rPr>
+        <w:t xml:space="preserve"> </w:t>
+      </w:r>
+      <w:proofErr w:type="spellStart"/>
+      <w:r>
+        <w:rPr>
+          <w:rFonts w:ascii="Times New Roman" w:hAnsi="Times New Roman" w:cs="Times New Roman"/>
+          <w:sz w:val="24"/>
+        </w:rPr>
+        <w:t>expressions</w:t>
+      </w:r>
+      <w:proofErr w:type="spellEnd"/>
+      <w:r>
+        <w:rPr>
+          <w:rFonts w:ascii="Times New Roman" w:hAnsi="Times New Roman" w:cs="Times New Roman"/>
+          <w:sz w:val="24"/>
+        </w:rPr>
+        <w:t xml:space="preserve"> </w:t>
+      </w:r>
+      <w:proofErr w:type="spellStart"/>
+      <w:r>
+        <w:rPr>
+          <w:rFonts w:ascii="Times New Roman" w:hAnsi="Times New Roman" w:cs="Times New Roman"/>
+          <w:sz w:val="24"/>
+        </w:rPr>
+        <w:t>including</w:t>
+      </w:r>
+      <w:proofErr w:type="spellEnd"/>
+      <w:r>
+        <w:rPr>
+          <w:rFonts w:ascii="Times New Roman" w:hAnsi="Times New Roman" w:cs="Times New Roman"/>
+          <w:sz w:val="24"/>
+        </w:rPr>
+        <w:t xml:space="preserve"> </w:t>
+      </w:r>
+      <w:proofErr w:type="spellStart"/>
+      <w:r>
+        <w:rPr>
+          <w:rFonts w:ascii="Times New Roman" w:hAnsi="Times New Roman" w:cs="Times New Roman"/>
+          <w:sz w:val="24"/>
+        </w:rPr>
+        <w:t>opacity</w:t>
+      </w:r>
+      <w:proofErr w:type="spellEnd"/>
+      <w:r>
+        <w:rPr>
+          <w:rFonts w:ascii="Times New Roman" w:hAnsi="Times New Roman" w:cs="Times New Roman"/>
+          <w:sz w:val="24"/>
+        </w:rPr>
+        <w:t xml:space="preserve"> // </w:t>
+      </w:r>
+      <w:proofErr w:type="spellStart"/>
+      <w:r>
+        <w:rPr>
+          <w:rFonts w:ascii="Times New Roman" w:hAnsi="Times New Roman" w:cs="Times New Roman"/>
+          <w:sz w:val="24"/>
+        </w:rPr>
+        <w:t>Matter</w:t>
+      </w:r>
+      <w:proofErr w:type="spellEnd"/>
+      <w:r>
+        <w:rPr>
+          <w:rFonts w:ascii="Times New Roman" w:hAnsi="Times New Roman" w:cs="Times New Roman"/>
+          <w:sz w:val="24"/>
+        </w:rPr>
+        <w:t xml:space="preserve"> and Radiation </w:t>
+      </w:r>
+      <w:proofErr w:type="spellStart"/>
+      <w:r>
+        <w:rPr>
+          <w:rFonts w:ascii="Times New Roman" w:hAnsi="Times New Roman" w:cs="Times New Roman"/>
+          <w:sz w:val="24"/>
+        </w:rPr>
+        <w:t>at</w:t>
+      </w:r>
+      <w:proofErr w:type="spellEnd"/>
+      <w:r>
+        <w:rPr>
+          <w:rFonts w:ascii="Times New Roman" w:hAnsi="Times New Roman" w:cs="Times New Roman"/>
+          <w:sz w:val="24"/>
+        </w:rPr>
+        <w:t xml:space="preserve"> </w:t>
+      </w:r>
+      <w:proofErr w:type="spellStart"/>
+      <w:r>
+        <w:rPr>
+          <w:rFonts w:ascii="Times New Roman" w:hAnsi="Times New Roman" w:cs="Times New Roman"/>
+          <w:sz w:val="24"/>
+        </w:rPr>
+        <w:t>Extremes</w:t>
+      </w:r>
+      <w:proofErr w:type="spellEnd"/>
+      <w:r>
+        <w:rPr>
+          <w:rFonts w:ascii="Times New Roman" w:hAnsi="Times New Roman" w:cs="Times New Roman"/>
+          <w:sz w:val="24"/>
+        </w:rPr>
+        <w:t>. – 2026. – V. 11. – No. 3. DOI: 10.1063/5.0315205</w:t>
       </w:r>
     </w:p>
     <w:p>
@@ -1069,12 +1834,181 @@
           <w:sz w:val="24"/>
         </w:rPr>
       </w:pPr>
-      <w:r>
-        <w:rPr>
-          <w:rFonts w:ascii="Times New Roman" w:hAnsi="Times New Roman" w:cs="Times New Roman"/>
-          <w:sz w:val="24"/>
-        </w:rPr>
-        <w:t>Astapenko V. A., Lisitsa V. S., Sakhno S. V. Multiphoton scattering of laser pulses on a metal nanosphere // The European Physical Journal D. – 2026. – V. 80. – No. 4. – P. 44. DOI: 10.1140/epjd/s10053-026-01154-7</w:t>
+      <w:proofErr w:type="spellStart"/>
+      <w:r>
+        <w:rPr>
+          <w:rFonts w:ascii="Times New Roman" w:hAnsi="Times New Roman" w:cs="Times New Roman"/>
+          <w:sz w:val="24"/>
+        </w:rPr>
+        <w:t>Astapenko</w:t>
+      </w:r>
+      <w:proofErr w:type="spellEnd"/>
+      <w:r>
+        <w:rPr>
+          <w:rFonts w:ascii="Times New Roman" w:hAnsi="Times New Roman" w:cs="Times New Roman"/>
+          <w:sz w:val="24"/>
+        </w:rPr>
+        <w:t xml:space="preserve"> V. A., </w:t>
+      </w:r>
+      <w:proofErr w:type="spellStart"/>
+      <w:r>
+        <w:rPr>
+          <w:rFonts w:ascii="Times New Roman" w:hAnsi="Times New Roman" w:cs="Times New Roman"/>
+          <w:sz w:val="24"/>
+        </w:rPr>
+        <w:t>Lisitsa</w:t>
+      </w:r>
+      <w:proofErr w:type="spellEnd"/>
+      <w:r>
+        <w:rPr>
+          <w:rFonts w:ascii="Times New Roman" w:hAnsi="Times New Roman" w:cs="Times New Roman"/>
+          <w:sz w:val="24"/>
+        </w:rPr>
+        <w:t xml:space="preserve"> V. S., </w:t>
+      </w:r>
+      <w:proofErr w:type="spellStart"/>
+      <w:r>
+        <w:rPr>
+          <w:rFonts w:ascii="Times New Roman" w:hAnsi="Times New Roman" w:cs="Times New Roman"/>
+          <w:sz w:val="24"/>
+        </w:rPr>
+        <w:t>Sakhno</w:t>
+      </w:r>
+      <w:proofErr w:type="spellEnd"/>
+      <w:r>
+        <w:rPr>
+          <w:rFonts w:ascii="Times New Roman" w:hAnsi="Times New Roman" w:cs="Times New Roman"/>
+          <w:sz w:val="24"/>
+        </w:rPr>
+        <w:t xml:space="preserve"> S. V. </w:t>
+      </w:r>
+      <w:proofErr w:type="spellStart"/>
+      <w:r>
+        <w:rPr>
+          <w:rFonts w:ascii="Times New Roman" w:hAnsi="Times New Roman" w:cs="Times New Roman"/>
+          <w:sz w:val="24"/>
+        </w:rPr>
+        <w:t>Multiphoton</w:t>
+      </w:r>
+      <w:proofErr w:type="spellEnd"/>
+      <w:r>
+        <w:rPr>
+          <w:rFonts w:ascii="Times New Roman" w:hAnsi="Times New Roman" w:cs="Times New Roman"/>
+          <w:sz w:val="24"/>
+        </w:rPr>
+        <w:t xml:space="preserve"> </w:t>
+      </w:r>
+      <w:proofErr w:type="spellStart"/>
+      <w:r>
+        <w:rPr>
+          <w:rFonts w:ascii="Times New Roman" w:hAnsi="Times New Roman" w:cs="Times New Roman"/>
+          <w:sz w:val="24"/>
+        </w:rPr>
+        <w:t>scattering</w:t>
+      </w:r>
+      <w:proofErr w:type="spellEnd"/>
+      <w:r>
+        <w:rPr>
+          <w:rFonts w:ascii="Times New Roman" w:hAnsi="Times New Roman" w:cs="Times New Roman"/>
+          <w:sz w:val="24"/>
+        </w:rPr>
+        <w:t xml:space="preserve"> </w:t>
+      </w:r>
+      <w:proofErr w:type="spellStart"/>
+      <w:r>
+        <w:rPr>
+          <w:rFonts w:ascii="Times New Roman" w:hAnsi="Times New Roman" w:cs="Times New Roman"/>
+          <w:sz w:val="24"/>
+        </w:rPr>
+        <w:t>of</w:t>
+      </w:r>
+      <w:proofErr w:type="spellEnd"/>
+      <w:r>
+        <w:rPr>
+          <w:rFonts w:ascii="Times New Roman" w:hAnsi="Times New Roman" w:cs="Times New Roman"/>
+          <w:sz w:val="24"/>
+        </w:rPr>
+        <w:t xml:space="preserve"> laser </w:t>
+      </w:r>
+      <w:proofErr w:type="spellStart"/>
+      <w:r>
+        <w:rPr>
+          <w:rFonts w:ascii="Times New Roman" w:hAnsi="Times New Roman" w:cs="Times New Roman"/>
+          <w:sz w:val="24"/>
+        </w:rPr>
+        <w:t>pulses</w:t>
+      </w:r>
+      <w:proofErr w:type="spellEnd"/>
+      <w:r>
+        <w:rPr>
+          <w:rFonts w:ascii="Times New Roman" w:hAnsi="Times New Roman" w:cs="Times New Roman"/>
+          <w:sz w:val="24"/>
+        </w:rPr>
+        <w:t xml:space="preserve"> on a </w:t>
+      </w:r>
+      <w:proofErr w:type="spellStart"/>
+      <w:r>
+        <w:rPr>
+          <w:rFonts w:ascii="Times New Roman" w:hAnsi="Times New Roman" w:cs="Times New Roman"/>
+          <w:sz w:val="24"/>
+        </w:rPr>
+        <w:t>metal</w:t>
+      </w:r>
+      <w:proofErr w:type="spellEnd"/>
+      <w:r>
+        <w:rPr>
+          <w:rFonts w:ascii="Times New Roman" w:hAnsi="Times New Roman" w:cs="Times New Roman"/>
+          <w:sz w:val="24"/>
+        </w:rPr>
+        <w:t xml:space="preserve"> </w:t>
+      </w:r>
+      <w:proofErr w:type="spellStart"/>
+      <w:r>
+        <w:rPr>
+          <w:rFonts w:ascii="Times New Roman" w:hAnsi="Times New Roman" w:cs="Times New Roman"/>
+          <w:sz w:val="24"/>
+        </w:rPr>
+        <w:t>nanosphere</w:t>
+      </w:r>
+      <w:proofErr w:type="spellEnd"/>
+      <w:r>
+        <w:rPr>
+          <w:rFonts w:ascii="Times New Roman" w:hAnsi="Times New Roman" w:cs="Times New Roman"/>
+          <w:sz w:val="24"/>
+        </w:rPr>
+        <w:t xml:space="preserve"> // The European </w:t>
+      </w:r>
+      <w:proofErr w:type="spellStart"/>
+      <w:r>
+        <w:rPr>
+          <w:rFonts w:ascii="Times New Roman" w:hAnsi="Times New Roman" w:cs="Times New Roman"/>
+          <w:sz w:val="24"/>
+        </w:rPr>
+        <w:t>Physical</w:t>
+      </w:r>
+      <w:proofErr w:type="spellEnd"/>
+      <w:r>
+        <w:rPr>
+          <w:rFonts w:ascii="Times New Roman" w:hAnsi="Times New Roman" w:cs="Times New Roman"/>
+          <w:sz w:val="24"/>
+        </w:rPr>
+        <w:t xml:space="preserve"> Journal D. – 2026. – V. 80. – No. 4. – P. 44. DOI: 10.1140/</w:t>
+      </w:r>
+      <w:proofErr w:type="spellStart"/>
+      <w:r>
+        <w:rPr>
+          <w:rFonts w:ascii="Times New Roman" w:hAnsi="Times New Roman" w:cs="Times New Roman"/>
+          <w:sz w:val="24"/>
+        </w:rPr>
+        <w:t>epjd</w:t>
+      </w:r>
+      <w:proofErr w:type="spellEnd"/>
+      <w:r>
+        <w:rPr>
+          <w:rFonts w:ascii="Times New Roman" w:hAnsi="Times New Roman" w:cs="Times New Roman"/>
+          <w:sz w:val="24"/>
+        </w:rPr>
+        <w:t>/s10053-026-01154-7</w:t>
       </w:r>
     </w:p>
     <w:p>
@@ -1090,12 +2024,293 @@
           <w:sz w:val="24"/>
         </w:rPr>
       </w:pPr>
-      <w:r>
-        <w:rPr>
-          <w:rFonts w:ascii="Times New Roman" w:hAnsi="Times New Roman" w:cs="Times New Roman"/>
-          <w:sz w:val="24"/>
-        </w:rPr>
-        <w:t>Rosmej F. B., Astapenko V. A., Lisitsa V. S. Scattering of ultrashort x-ray pulses in optically dense plasmas: Account for pulse duration and propagation effects // Physics of Plasmas. – 2024. – V. 31. – No. 11. DOI: 10.1063/5.0238655</w:t>
+      <w:proofErr w:type="spellStart"/>
+      <w:r>
+        <w:rPr>
+          <w:rFonts w:ascii="Times New Roman" w:hAnsi="Times New Roman" w:cs="Times New Roman"/>
+          <w:sz w:val="24"/>
+        </w:rPr>
+        <w:t>Rosmej</w:t>
+      </w:r>
+      <w:proofErr w:type="spellEnd"/>
+      <w:r>
+        <w:rPr>
+          <w:rFonts w:ascii="Times New Roman" w:hAnsi="Times New Roman" w:cs="Times New Roman"/>
+          <w:sz w:val="24"/>
+        </w:rPr>
+        <w:t xml:space="preserve"> F. B., </w:t>
+      </w:r>
+      <w:proofErr w:type="spellStart"/>
+      <w:r>
+        <w:rPr>
+          <w:rFonts w:ascii="Times New Roman" w:hAnsi="Times New Roman" w:cs="Times New Roman"/>
+          <w:sz w:val="24"/>
+        </w:rPr>
+        <w:t>Astapenko</w:t>
+      </w:r>
+      <w:proofErr w:type="spellEnd"/>
+      <w:r>
+        <w:rPr>
+          <w:rFonts w:ascii="Times New Roman" w:hAnsi="Times New Roman" w:cs="Times New Roman"/>
+          <w:sz w:val="24"/>
+        </w:rPr>
+        <w:t xml:space="preserve"> V. A., </w:t>
+      </w:r>
+      <w:proofErr w:type="spellStart"/>
+      <w:r>
+        <w:rPr>
+          <w:rFonts w:ascii="Times New Roman" w:hAnsi="Times New Roman" w:cs="Times New Roman"/>
+          <w:sz w:val="24"/>
+        </w:rPr>
+        <w:t>Lisitsa</w:t>
+      </w:r>
+      <w:proofErr w:type="spellEnd"/>
+      <w:r>
+        <w:rPr>
+          <w:rFonts w:ascii="Times New Roman" w:hAnsi="Times New Roman" w:cs="Times New Roman"/>
+          <w:sz w:val="24"/>
+        </w:rPr>
+        <w:t xml:space="preserve"> V. S. </w:t>
+      </w:r>
+      <w:proofErr w:type="spellStart"/>
+      <w:r>
+        <w:rPr>
+          <w:rFonts w:ascii="Times New Roman" w:hAnsi="Times New Roman" w:cs="Times New Roman"/>
+          <w:sz w:val="24"/>
+        </w:rPr>
+        <w:t>Scattering</w:t>
+      </w:r>
+      <w:proofErr w:type="spellEnd"/>
+      <w:r>
+        <w:rPr>
+          <w:rFonts w:ascii="Times New Roman" w:hAnsi="Times New Roman" w:cs="Times New Roman"/>
+          <w:sz w:val="24"/>
+        </w:rPr>
+        <w:t xml:space="preserve"> </w:t>
+      </w:r>
+      <w:proofErr w:type="spellStart"/>
+      <w:r>
+        <w:rPr>
+          <w:rFonts w:ascii="Times New Roman" w:hAnsi="Times New Roman" w:cs="Times New Roman"/>
+          <w:sz w:val="24"/>
+        </w:rPr>
+        <w:t>of</w:t>
+      </w:r>
+      <w:proofErr w:type="spellEnd"/>
+      <w:r>
+        <w:rPr>
+          <w:rFonts w:ascii="Times New Roman" w:hAnsi="Times New Roman" w:cs="Times New Roman"/>
+          <w:sz w:val="24"/>
+        </w:rPr>
+        <w:t xml:space="preserve"> </w:t>
+      </w:r>
+      <w:proofErr w:type="spellStart"/>
+      <w:r>
+        <w:rPr>
+          <w:rFonts w:ascii="Times New Roman" w:hAnsi="Times New Roman" w:cs="Times New Roman"/>
+          <w:sz w:val="24"/>
+        </w:rPr>
+        <w:t>ultrashort</w:t>
+      </w:r>
+      <w:proofErr w:type="spellEnd"/>
+      <w:r>
+        <w:rPr>
+          <w:rFonts w:ascii="Times New Roman" w:hAnsi="Times New Roman" w:cs="Times New Roman"/>
+          <w:sz w:val="24"/>
+        </w:rPr>
+        <w:t xml:space="preserve"> x-</w:t>
+      </w:r>
+      <w:proofErr w:type="spellStart"/>
+      <w:r>
+        <w:rPr>
+          <w:rFonts w:ascii="Times New Roman" w:hAnsi="Times New Roman" w:cs="Times New Roman"/>
+          <w:sz w:val="24"/>
+        </w:rPr>
+        <w:t>ray</w:t>
+      </w:r>
+      <w:proofErr w:type="spellEnd"/>
+      <w:r>
+        <w:rPr>
+          <w:rFonts w:ascii="Times New Roman" w:hAnsi="Times New Roman" w:cs="Times New Roman"/>
+          <w:sz w:val="24"/>
+        </w:rPr>
+        <w:t xml:space="preserve"> </w:t>
+      </w:r>
+      <w:proofErr w:type="spellStart"/>
+      <w:r>
+        <w:rPr>
+          <w:rFonts w:ascii="Times New Roman" w:hAnsi="Times New Roman" w:cs="Times New Roman"/>
+          <w:sz w:val="24"/>
+        </w:rPr>
+        <w:t>pulses</w:t>
+      </w:r>
+      <w:proofErr w:type="spellEnd"/>
+      <w:r>
+        <w:rPr>
+          <w:rFonts w:ascii="Times New Roman" w:hAnsi="Times New Roman" w:cs="Times New Roman"/>
+          <w:sz w:val="24"/>
+        </w:rPr>
+        <w:t xml:space="preserve"> in </w:t>
+      </w:r>
+      <w:proofErr w:type="spellStart"/>
+      <w:r>
+        <w:rPr>
+          <w:rFonts w:ascii="Times New Roman" w:hAnsi="Times New Roman" w:cs="Times New Roman"/>
+          <w:sz w:val="24"/>
+        </w:rPr>
+        <w:t>optically</w:t>
+      </w:r>
+      <w:proofErr w:type="spellEnd"/>
+      <w:r>
+        <w:rPr>
+          <w:rFonts w:ascii="Times New Roman" w:hAnsi="Times New Roman" w:cs="Times New Roman"/>
+          <w:sz w:val="24"/>
+        </w:rPr>
+        <w:t xml:space="preserve"> </w:t>
+      </w:r>
+      <w:proofErr w:type="spellStart"/>
+      <w:r>
+        <w:rPr>
+          <w:rFonts w:ascii="Times New Roman" w:hAnsi="Times New Roman" w:cs="Times New Roman"/>
+          <w:sz w:val="24"/>
+        </w:rPr>
+        <w:t>dense</w:t>
+      </w:r>
+      <w:proofErr w:type="spellEnd"/>
+      <w:r>
+        <w:rPr>
+          <w:rFonts w:ascii="Times New Roman" w:hAnsi="Times New Roman" w:cs="Times New Roman"/>
+          <w:sz w:val="24"/>
+        </w:rPr>
+        <w:t xml:space="preserve"> </w:t>
+      </w:r>
+      <w:proofErr w:type="spellStart"/>
+      <w:r>
+        <w:rPr>
+          <w:rFonts w:ascii="Times New Roman" w:hAnsi="Times New Roman" w:cs="Times New Roman"/>
+          <w:sz w:val="24"/>
+        </w:rPr>
+        <w:t>plasmas</w:t>
+      </w:r>
+      <w:proofErr w:type="spellEnd"/>
+      <w:r>
+        <w:rPr>
+          <w:rFonts w:ascii="Times New Roman" w:hAnsi="Times New Roman" w:cs="Times New Roman"/>
+          <w:sz w:val="24"/>
+        </w:rPr>
+        <w:t xml:space="preserve">: </w:t>
+      </w:r>
+      <w:proofErr w:type="spellStart"/>
+      <w:r>
+        <w:rPr>
+          <w:rFonts w:ascii="Times New Roman" w:hAnsi="Times New Roman" w:cs="Times New Roman"/>
+          <w:sz w:val="24"/>
+        </w:rPr>
+        <w:t>Account</w:t>
+      </w:r>
+      <w:proofErr w:type="spellEnd"/>
+      <w:r>
+        <w:rPr>
+          <w:rFonts w:ascii="Times New Roman" w:hAnsi="Times New Roman" w:cs="Times New Roman"/>
+          <w:sz w:val="24"/>
+        </w:rPr>
+        <w:t xml:space="preserve"> for </w:t>
+      </w:r>
+      <w:proofErr w:type="spellStart"/>
+      <w:r>
+        <w:rPr>
+          <w:rFonts w:ascii="Times New Roman" w:hAnsi="Times New Roman" w:cs="Times New Roman"/>
+          <w:sz w:val="24"/>
+        </w:rPr>
+        <w:t>pulse</w:t>
+      </w:r>
+      <w:proofErr w:type="spellEnd"/>
+      <w:r>
+        <w:rPr>
+          <w:rFonts w:ascii="Times New Roman" w:hAnsi="Times New Roman" w:cs="Times New Roman"/>
+          <w:sz w:val="24"/>
+        </w:rPr>
+        <w:t xml:space="preserve"> </w:t>
+      </w:r>
+      <w:proofErr w:type="spellStart"/>
+      <w:r>
+        <w:rPr>
+          <w:rFonts w:ascii="Times New Roman" w:hAnsi="Times New Roman" w:cs="Times New Roman"/>
+          <w:sz w:val="24"/>
+        </w:rPr>
+        <w:t>duration</w:t>
+      </w:r>
+      <w:proofErr w:type="spellEnd"/>
+      <w:r>
+        <w:rPr>
+          <w:rFonts w:ascii="Times New Roman" w:hAnsi="Times New Roman" w:cs="Times New Roman"/>
+          <w:sz w:val="24"/>
+        </w:rPr>
+        <w:t xml:space="preserve"> and </w:t>
+      </w:r>
+      <w:proofErr w:type="spellStart"/>
+      <w:r>
+        <w:rPr>
+          <w:rFonts w:ascii="Times New Roman" w:hAnsi="Times New Roman" w:cs="Times New Roman"/>
+          <w:sz w:val="24"/>
+        </w:rPr>
+        <w:t>propagation</w:t>
+      </w:r>
+      <w:proofErr w:type="spellEnd"/>
+      <w:r>
+        <w:rPr>
+          <w:rFonts w:ascii="Times New Roman" w:hAnsi="Times New Roman" w:cs="Times New Roman"/>
+          <w:sz w:val="24"/>
+        </w:rPr>
+        <w:t xml:space="preserve"> </w:t>
+      </w:r>
+      <w:proofErr w:type="spellStart"/>
+      <w:r>
+        <w:rPr>
+          <w:rFonts w:ascii="Times New Roman" w:hAnsi="Times New Roman" w:cs="Times New Roman"/>
+          <w:sz w:val="24"/>
+        </w:rPr>
+        <w:t>effects</w:t>
+      </w:r>
+      <w:proofErr w:type="spellEnd"/>
+      <w:r>
+        <w:rPr>
+          <w:rFonts w:ascii="Times New Roman" w:hAnsi="Times New Roman" w:cs="Times New Roman"/>
+          <w:sz w:val="24"/>
+        </w:rPr>
+        <w:t xml:space="preserve"> // Physics </w:t>
+      </w:r>
+      <w:proofErr w:type="spellStart"/>
+      <w:r>
+        <w:rPr>
+          <w:rFonts w:ascii="Times New Roman" w:hAnsi="Times New Roman" w:cs="Times New Roman"/>
+          <w:sz w:val="24"/>
+        </w:rPr>
+        <w:t>of</w:t>
+      </w:r>
+      <w:proofErr w:type="spellEnd"/>
+      <w:r>
+        <w:rPr>
+          <w:rFonts w:ascii="Times New Roman" w:hAnsi="Times New Roman" w:cs="Times New Roman"/>
+          <w:sz w:val="24"/>
+        </w:rPr>
+        <w:t xml:space="preserve"> </w:t>
+      </w:r>
+      <w:proofErr w:type="spellStart"/>
+      <w:r>
+        <w:rPr>
+          <w:rFonts w:ascii="Times New Roman" w:hAnsi="Times New Roman" w:cs="Times New Roman"/>
+          <w:sz w:val="24"/>
+        </w:rPr>
+        <w:t>Plasmas</w:t>
+      </w:r>
+      <w:proofErr w:type="spellEnd"/>
+      <w:r>
+        <w:rPr>
+          <w:rFonts w:ascii="Times New Roman" w:hAnsi="Times New Roman" w:cs="Times New Roman"/>
+          <w:sz w:val="24"/>
+        </w:rPr>
+        <w:t>. – 2024. – V. 31. – No. 11. DOI: 10.1063/5.0238655</w:t>
       </w:r>
     </w:p>
     <w:p>
@@ -1111,12 +2326,261 @@
           <w:sz w:val="24"/>
         </w:rPr>
       </w:pPr>
-      <w:r>
-        <w:rPr>
-          <w:rFonts w:ascii="Times New Roman" w:hAnsi="Times New Roman" w:cs="Times New Roman"/>
-          <w:sz w:val="24"/>
-        </w:rPr>
-        <w:t>Astapenko V. A., Lisitsa V. S. Kinetics of dense plasma in the field of short laser pulses: A generalized approach // Matter and Radiation at Extremes. – 2024. – V. 9. – No. 5. DOI: 10.1063/5.0210407</w:t>
+      <w:proofErr w:type="spellStart"/>
+      <w:r>
+        <w:rPr>
+          <w:rFonts w:ascii="Times New Roman" w:hAnsi="Times New Roman" w:cs="Times New Roman"/>
+          <w:sz w:val="24"/>
+        </w:rPr>
+        <w:t>Astapenko</w:t>
+      </w:r>
+      <w:proofErr w:type="spellEnd"/>
+      <w:r>
+        <w:rPr>
+          <w:rFonts w:ascii="Times New Roman" w:hAnsi="Times New Roman" w:cs="Times New Roman"/>
+          <w:sz w:val="24"/>
+        </w:rPr>
+        <w:t xml:space="preserve"> V. A., </w:t>
+      </w:r>
+      <w:proofErr w:type="spellStart"/>
+      <w:r>
+        <w:rPr>
+          <w:rFonts w:ascii="Times New Roman" w:hAnsi="Times New Roman" w:cs="Times New Roman"/>
+          <w:sz w:val="24"/>
+        </w:rPr>
+        <w:t>Lisitsa</w:t>
+      </w:r>
+      <w:proofErr w:type="spellEnd"/>
+      <w:r>
+        <w:rPr>
+          <w:rFonts w:ascii="Times New Roman" w:hAnsi="Times New Roman" w:cs="Times New Roman"/>
+          <w:sz w:val="24"/>
+        </w:rPr>
+        <w:t xml:space="preserve"> V. S. </w:t>
+      </w:r>
+      <w:proofErr w:type="spellStart"/>
+      <w:r>
+        <w:rPr>
+          <w:rFonts w:ascii="Times New Roman" w:hAnsi="Times New Roman" w:cs="Times New Roman"/>
+          <w:sz w:val="24"/>
+        </w:rPr>
+        <w:t>Kinetics</w:t>
+      </w:r>
+      <w:proofErr w:type="spellEnd"/>
+      <w:r>
+        <w:rPr>
+          <w:rFonts w:ascii="Times New Roman" w:hAnsi="Times New Roman" w:cs="Times New Roman"/>
+          <w:sz w:val="24"/>
+        </w:rPr>
+        <w:t xml:space="preserve"> </w:t>
+      </w:r>
+      <w:proofErr w:type="spellStart"/>
+      <w:r>
+        <w:rPr>
+          <w:rFonts w:ascii="Times New Roman" w:hAnsi="Times New Roman" w:cs="Times New Roman"/>
+          <w:sz w:val="24"/>
+        </w:rPr>
+        <w:t>of</w:t>
+      </w:r>
+      <w:proofErr w:type="spellEnd"/>
+      <w:r>
+        <w:rPr>
+          <w:rFonts w:ascii="Times New Roman" w:hAnsi="Times New Roman" w:cs="Times New Roman"/>
+          <w:sz w:val="24"/>
+        </w:rPr>
+        <w:t xml:space="preserve"> </w:t>
+      </w:r>
+      <w:proofErr w:type="spellStart"/>
+      <w:r>
+        <w:rPr>
+          <w:rFonts w:ascii="Times New Roman" w:hAnsi="Times New Roman" w:cs="Times New Roman"/>
+          <w:sz w:val="24"/>
+        </w:rPr>
+        <w:t>dense</w:t>
+      </w:r>
+      <w:proofErr w:type="spellEnd"/>
+      <w:r>
+        <w:rPr>
+          <w:rFonts w:ascii="Times New Roman" w:hAnsi="Times New Roman" w:cs="Times New Roman"/>
+          <w:sz w:val="24"/>
+        </w:rPr>
+        <w:t xml:space="preserve"> </w:t>
+      </w:r>
+      <w:proofErr w:type="spellStart"/>
+      <w:r>
+        <w:rPr>
+          <w:rFonts w:ascii="Times New Roman" w:hAnsi="Times New Roman" w:cs="Times New Roman"/>
+          <w:sz w:val="24"/>
+        </w:rPr>
+        <w:t>plasma</w:t>
+      </w:r>
+      <w:proofErr w:type="spellEnd"/>
+      <w:r>
+        <w:rPr>
+          <w:rFonts w:ascii="Times New Roman" w:hAnsi="Times New Roman" w:cs="Times New Roman"/>
+          <w:sz w:val="24"/>
+        </w:rPr>
+        <w:t xml:space="preserve"> in </w:t>
+      </w:r>
+      <w:proofErr w:type="spellStart"/>
+      <w:r>
+        <w:rPr>
+          <w:rFonts w:ascii="Times New Roman" w:hAnsi="Times New Roman" w:cs="Times New Roman"/>
+          <w:sz w:val="24"/>
+        </w:rPr>
+        <w:t>the</w:t>
+      </w:r>
+      <w:proofErr w:type="spellEnd"/>
+      <w:r>
+        <w:rPr>
+          <w:rFonts w:ascii="Times New Roman" w:hAnsi="Times New Roman" w:cs="Times New Roman"/>
+          <w:sz w:val="24"/>
+        </w:rPr>
+        <w:t xml:space="preserve"> </w:t>
+      </w:r>
+      <w:proofErr w:type="spellStart"/>
+      <w:r>
+        <w:rPr>
+          <w:rFonts w:ascii="Times New Roman" w:hAnsi="Times New Roman" w:cs="Times New Roman"/>
+          <w:sz w:val="24"/>
+        </w:rPr>
+        <w:t>field</w:t>
+      </w:r>
+      <w:proofErr w:type="spellEnd"/>
+      <w:r>
+        <w:rPr>
+          <w:rFonts w:ascii="Times New Roman" w:hAnsi="Times New Roman" w:cs="Times New Roman"/>
+          <w:sz w:val="24"/>
+        </w:rPr>
+        <w:t xml:space="preserve"> </w:t>
+      </w:r>
+      <w:proofErr w:type="spellStart"/>
+      <w:r>
+        <w:rPr>
+          <w:rFonts w:ascii="Times New Roman" w:hAnsi="Times New Roman" w:cs="Times New Roman"/>
+          <w:sz w:val="24"/>
+        </w:rPr>
+        <w:t>of</w:t>
+      </w:r>
+      <w:proofErr w:type="spellEnd"/>
+      <w:r>
+        <w:rPr>
+          <w:rFonts w:ascii="Times New Roman" w:hAnsi="Times New Roman" w:cs="Times New Roman"/>
+          <w:sz w:val="24"/>
+        </w:rPr>
+        <w:t xml:space="preserve"> </w:t>
+      </w:r>
+      <w:proofErr w:type="spellStart"/>
+      <w:r>
+        <w:rPr>
+          <w:rFonts w:ascii="Times New Roman" w:hAnsi="Times New Roman" w:cs="Times New Roman"/>
+          <w:sz w:val="24"/>
+        </w:rPr>
+        <w:t>short</w:t>
+      </w:r>
+      <w:proofErr w:type="spellEnd"/>
+      <w:r>
+        <w:rPr>
+          <w:rFonts w:ascii="Times New Roman" w:hAnsi="Times New Roman" w:cs="Times New Roman"/>
+          <w:sz w:val="24"/>
+        </w:rPr>
+        <w:t xml:space="preserve"> laser </w:t>
+      </w:r>
+      <w:proofErr w:type="spellStart"/>
+      <w:r>
+        <w:rPr>
+          <w:rFonts w:ascii="Times New Roman" w:hAnsi="Times New Roman" w:cs="Times New Roman"/>
+          <w:sz w:val="24"/>
+        </w:rPr>
+        <w:t>pulses</w:t>
+      </w:r>
+      <w:proofErr w:type="spellEnd"/>
+      <w:r>
+        <w:rPr>
+          <w:rFonts w:ascii="Times New Roman" w:hAnsi="Times New Roman" w:cs="Times New Roman"/>
+          <w:sz w:val="24"/>
+        </w:rPr>
+        <w:t xml:space="preserve">: A </w:t>
+      </w:r>
+      <w:proofErr w:type="spellStart"/>
+      <w:r>
+        <w:rPr>
+          <w:rFonts w:ascii="Times New Roman" w:hAnsi="Times New Roman" w:cs="Times New Roman"/>
+          <w:sz w:val="24"/>
+        </w:rPr>
+        <w:t>generalized</w:t>
+      </w:r>
+      <w:proofErr w:type="spellEnd"/>
+      <w:r>
+        <w:rPr>
+          <w:rFonts w:ascii="Times New Roman" w:hAnsi="Times New Roman" w:cs="Times New Roman"/>
+          <w:sz w:val="24"/>
+        </w:rPr>
+        <w:t xml:space="preserve"> </w:t>
+      </w:r>
+      <w:proofErr w:type="spellStart"/>
+      <w:r>
+        <w:rPr>
+          <w:rFonts w:ascii="Times New Roman" w:hAnsi="Times New Roman" w:cs="Times New Roman"/>
+          <w:sz w:val="24"/>
+        </w:rPr>
+        <w:t>approach</w:t>
+      </w:r>
+      <w:proofErr w:type="spellEnd"/>
+      <w:r>
+        <w:rPr>
+          <w:rFonts w:ascii="Times New Roman" w:hAnsi="Times New Roman" w:cs="Times New Roman"/>
+          <w:sz w:val="24"/>
+        </w:rPr>
+        <w:t xml:space="preserve"> // </w:t>
+      </w:r>
+      <w:proofErr w:type="spellStart"/>
+      <w:r>
+        <w:rPr>
+          <w:rFonts w:ascii="Times New Roman" w:hAnsi="Times New Roman" w:cs="Times New Roman"/>
+          <w:sz w:val="24"/>
+        </w:rPr>
+        <w:t>Matter</w:t>
+      </w:r>
+      <w:proofErr w:type="spellEnd"/>
+      <w:r>
+        <w:rPr>
+          <w:rFonts w:ascii="Times New Roman" w:hAnsi="Times New Roman" w:cs="Times New Roman"/>
+          <w:sz w:val="24"/>
+        </w:rPr>
+        <w:t xml:space="preserve"> and Radiation </w:t>
+      </w:r>
+      <w:proofErr w:type="spellStart"/>
+      <w:r>
+        <w:rPr>
+          <w:rFonts w:ascii="Times New Roman" w:hAnsi="Times New Roman" w:cs="Times New Roman"/>
+          <w:sz w:val="24"/>
+        </w:rPr>
+        <w:t>at</w:t>
+      </w:r>
+      <w:proofErr w:type="spellEnd"/>
+      <w:r>
+        <w:rPr>
+          <w:rFonts w:ascii="Times New Roman" w:hAnsi="Times New Roman" w:cs="Times New Roman"/>
+          <w:sz w:val="24"/>
+        </w:rPr>
+        <w:t xml:space="preserve"> </w:t>
+      </w:r>
+      <w:proofErr w:type="spellStart"/>
+      <w:r>
+        <w:rPr>
+          <w:rFonts w:ascii="Times New Roman" w:hAnsi="Times New Roman" w:cs="Times New Roman"/>
+          <w:sz w:val="24"/>
+        </w:rPr>
+        <w:t>Extremes</w:t>
+      </w:r>
+      <w:proofErr w:type="spellEnd"/>
+      <w:r>
+        <w:rPr>
+          <w:rFonts w:ascii="Times New Roman" w:hAnsi="Times New Roman" w:cs="Times New Roman"/>
+          <w:sz w:val="24"/>
+        </w:rPr>
+        <w:t>. – 2024. – V. 9. – No. 5. DOI: 10.1063/5.0210407</w:t>
       </w:r>
     </w:p>
     <w:p>
@@ -1132,12 +2596,197 @@
           <w:sz w:val="24"/>
         </w:rPr>
       </w:pPr>
-      <w:r>
-        <w:rPr>
-          <w:rFonts w:ascii="Times New Roman" w:hAnsi="Times New Roman" w:cs="Times New Roman"/>
-          <w:sz w:val="24"/>
-        </w:rPr>
-        <w:t xml:space="preserve">Astapenko V. A. Energy transfer from ultrashort electromagnetic pulses to a medium: From micro to macro description // Physics Letters A. – 2023. – V. 483. – P. 129050. DOI: 10.1016/j.physleta.2023.129050 </w:t>
+      <w:proofErr w:type="spellStart"/>
+      <w:r>
+        <w:rPr>
+          <w:rFonts w:ascii="Times New Roman" w:hAnsi="Times New Roman" w:cs="Times New Roman"/>
+          <w:sz w:val="24"/>
+        </w:rPr>
+        <w:t>Astapenko</w:t>
+      </w:r>
+      <w:proofErr w:type="spellEnd"/>
+      <w:r>
+        <w:rPr>
+          <w:rFonts w:ascii="Times New Roman" w:hAnsi="Times New Roman" w:cs="Times New Roman"/>
+          <w:sz w:val="24"/>
+        </w:rPr>
+        <w:t xml:space="preserve"> V. A. Energy </w:t>
+      </w:r>
+      <w:proofErr w:type="spellStart"/>
+      <w:r>
+        <w:rPr>
+          <w:rFonts w:ascii="Times New Roman" w:hAnsi="Times New Roman" w:cs="Times New Roman"/>
+          <w:sz w:val="24"/>
+        </w:rPr>
+        <w:t>transfer</w:t>
+      </w:r>
+      <w:proofErr w:type="spellEnd"/>
+      <w:r>
+        <w:rPr>
+          <w:rFonts w:ascii="Times New Roman" w:hAnsi="Times New Roman" w:cs="Times New Roman"/>
+          <w:sz w:val="24"/>
+        </w:rPr>
+        <w:t xml:space="preserve"> </w:t>
+      </w:r>
+      <w:proofErr w:type="spellStart"/>
+      <w:r>
+        <w:rPr>
+          <w:rFonts w:ascii="Times New Roman" w:hAnsi="Times New Roman" w:cs="Times New Roman"/>
+          <w:sz w:val="24"/>
+        </w:rPr>
+        <w:t>from</w:t>
+      </w:r>
+      <w:proofErr w:type="spellEnd"/>
+      <w:r>
+        <w:rPr>
+          <w:rFonts w:ascii="Times New Roman" w:hAnsi="Times New Roman" w:cs="Times New Roman"/>
+          <w:sz w:val="24"/>
+        </w:rPr>
+        <w:t xml:space="preserve"> </w:t>
+      </w:r>
+      <w:proofErr w:type="spellStart"/>
+      <w:r>
+        <w:rPr>
+          <w:rFonts w:ascii="Times New Roman" w:hAnsi="Times New Roman" w:cs="Times New Roman"/>
+          <w:sz w:val="24"/>
+        </w:rPr>
+        <w:t>ultrashort</w:t>
+      </w:r>
+      <w:proofErr w:type="spellEnd"/>
+      <w:r>
+        <w:rPr>
+          <w:rFonts w:ascii="Times New Roman" w:hAnsi="Times New Roman" w:cs="Times New Roman"/>
+          <w:sz w:val="24"/>
+        </w:rPr>
+        <w:t xml:space="preserve"> </w:t>
+      </w:r>
+      <w:proofErr w:type="spellStart"/>
+      <w:r>
+        <w:rPr>
+          <w:rFonts w:ascii="Times New Roman" w:hAnsi="Times New Roman" w:cs="Times New Roman"/>
+          <w:sz w:val="24"/>
+        </w:rPr>
+        <w:t>electromagnetic</w:t>
+      </w:r>
+      <w:proofErr w:type="spellEnd"/>
+      <w:r>
+        <w:rPr>
+          <w:rFonts w:ascii="Times New Roman" w:hAnsi="Times New Roman" w:cs="Times New Roman"/>
+          <w:sz w:val="24"/>
+        </w:rPr>
+        <w:t xml:space="preserve"> </w:t>
+      </w:r>
+      <w:proofErr w:type="spellStart"/>
+      <w:r>
+        <w:rPr>
+          <w:rFonts w:ascii="Times New Roman" w:hAnsi="Times New Roman" w:cs="Times New Roman"/>
+          <w:sz w:val="24"/>
+        </w:rPr>
+        <w:t>pulses</w:t>
+      </w:r>
+      <w:proofErr w:type="spellEnd"/>
+      <w:r>
+        <w:rPr>
+          <w:rFonts w:ascii="Times New Roman" w:hAnsi="Times New Roman" w:cs="Times New Roman"/>
+          <w:sz w:val="24"/>
+        </w:rPr>
+        <w:t xml:space="preserve"> </w:t>
+      </w:r>
+      <w:proofErr w:type="spellStart"/>
+      <w:r>
+        <w:rPr>
+          <w:rFonts w:ascii="Times New Roman" w:hAnsi="Times New Roman" w:cs="Times New Roman"/>
+          <w:sz w:val="24"/>
+        </w:rPr>
+        <w:t>to</w:t>
+      </w:r>
+      <w:proofErr w:type="spellEnd"/>
+      <w:r>
+        <w:rPr>
+          <w:rFonts w:ascii="Times New Roman" w:hAnsi="Times New Roman" w:cs="Times New Roman"/>
+          <w:sz w:val="24"/>
+        </w:rPr>
+        <w:t xml:space="preserve"> a </w:t>
+      </w:r>
+      <w:proofErr w:type="spellStart"/>
+      <w:r>
+        <w:rPr>
+          <w:rFonts w:ascii="Times New Roman" w:hAnsi="Times New Roman" w:cs="Times New Roman"/>
+          <w:sz w:val="24"/>
+        </w:rPr>
+        <w:t>medium</w:t>
+      </w:r>
+      <w:proofErr w:type="spellEnd"/>
+      <w:r>
+        <w:rPr>
+          <w:rFonts w:ascii="Times New Roman" w:hAnsi="Times New Roman" w:cs="Times New Roman"/>
+          <w:sz w:val="24"/>
+        </w:rPr>
+        <w:t xml:space="preserve">: From </w:t>
+      </w:r>
+      <w:proofErr w:type="spellStart"/>
+      <w:r>
+        <w:rPr>
+          <w:rFonts w:ascii="Times New Roman" w:hAnsi="Times New Roman" w:cs="Times New Roman"/>
+          <w:sz w:val="24"/>
+        </w:rPr>
+        <w:t>micro</w:t>
+      </w:r>
+      <w:proofErr w:type="spellEnd"/>
+      <w:r>
+        <w:rPr>
+          <w:rFonts w:ascii="Times New Roman" w:hAnsi="Times New Roman" w:cs="Times New Roman"/>
+          <w:sz w:val="24"/>
+        </w:rPr>
+        <w:t xml:space="preserve"> </w:t>
+      </w:r>
+      <w:proofErr w:type="spellStart"/>
+      <w:r>
+        <w:rPr>
+          <w:rFonts w:ascii="Times New Roman" w:hAnsi="Times New Roman" w:cs="Times New Roman"/>
+          <w:sz w:val="24"/>
+        </w:rPr>
+        <w:t>to</w:t>
+      </w:r>
+      <w:proofErr w:type="spellEnd"/>
+      <w:r>
+        <w:rPr>
+          <w:rFonts w:ascii="Times New Roman" w:hAnsi="Times New Roman" w:cs="Times New Roman"/>
+          <w:sz w:val="24"/>
+        </w:rPr>
+        <w:t xml:space="preserve"> </w:t>
+      </w:r>
+      <w:proofErr w:type="spellStart"/>
+      <w:r>
+        <w:rPr>
+          <w:rFonts w:ascii="Times New Roman" w:hAnsi="Times New Roman" w:cs="Times New Roman"/>
+          <w:sz w:val="24"/>
+        </w:rPr>
+        <w:t>macro</w:t>
+      </w:r>
+      <w:proofErr w:type="spellEnd"/>
+      <w:r>
+        <w:rPr>
+          <w:rFonts w:ascii="Times New Roman" w:hAnsi="Times New Roman" w:cs="Times New Roman"/>
+          <w:sz w:val="24"/>
+        </w:rPr>
+        <w:t xml:space="preserve"> </w:t>
+      </w:r>
+      <w:proofErr w:type="spellStart"/>
+      <w:r>
+        <w:rPr>
+          <w:rFonts w:ascii="Times New Roman" w:hAnsi="Times New Roman" w:cs="Times New Roman"/>
+          <w:sz w:val="24"/>
+        </w:rPr>
+        <w:t>description</w:t>
+      </w:r>
+      <w:proofErr w:type="spellEnd"/>
+      <w:r>
+        <w:rPr>
+          <w:rFonts w:ascii="Times New Roman" w:hAnsi="Times New Roman" w:cs="Times New Roman"/>
+          <w:sz w:val="24"/>
+        </w:rPr>
+        <w:t xml:space="preserve"> // Physics Letters A. – 2023. – V. 483. – P. 129050. DOI: 10.1016/j.physleta.2023.129050 </w:t>
       </w:r>
     </w:p>
     <w:p>
@@ -1153,12 +2802,197 @@
           <w:sz w:val="24"/>
         </w:rPr>
       </w:pPr>
-      <w:r>
-        <w:rPr>
-          <w:rFonts w:ascii="Times New Roman" w:hAnsi="Times New Roman" w:cs="Times New Roman"/>
-          <w:sz w:val="24"/>
-        </w:rPr>
-        <w:t xml:space="preserve">Khramov E. S., Astapenko V. A. Scattering of X-ray Ultrashort Laser Pulses on Bound Electrons in Dense Plasma // Atoms. – 2023. – V. 11. – No. 6. – P. 100. DOI: 10.3390/atoms11060100 </w:t>
+      <w:proofErr w:type="spellStart"/>
+      <w:r>
+        <w:rPr>
+          <w:rFonts w:ascii="Times New Roman" w:hAnsi="Times New Roman" w:cs="Times New Roman"/>
+          <w:sz w:val="24"/>
+        </w:rPr>
+        <w:t>Khramov</w:t>
+      </w:r>
+      <w:proofErr w:type="spellEnd"/>
+      <w:r>
+        <w:rPr>
+          <w:rFonts w:ascii="Times New Roman" w:hAnsi="Times New Roman" w:cs="Times New Roman"/>
+          <w:sz w:val="24"/>
+        </w:rPr>
+        <w:t xml:space="preserve"> E. S., </w:t>
+      </w:r>
+      <w:proofErr w:type="spellStart"/>
+      <w:r>
+        <w:rPr>
+          <w:rFonts w:ascii="Times New Roman" w:hAnsi="Times New Roman" w:cs="Times New Roman"/>
+          <w:sz w:val="24"/>
+        </w:rPr>
+        <w:t>Astapenko</w:t>
+      </w:r>
+      <w:proofErr w:type="spellEnd"/>
+      <w:r>
+        <w:rPr>
+          <w:rFonts w:ascii="Times New Roman" w:hAnsi="Times New Roman" w:cs="Times New Roman"/>
+          <w:sz w:val="24"/>
+        </w:rPr>
+        <w:t xml:space="preserve"> V. A. </w:t>
+      </w:r>
+      <w:proofErr w:type="spellStart"/>
+      <w:r>
+        <w:rPr>
+          <w:rFonts w:ascii="Times New Roman" w:hAnsi="Times New Roman" w:cs="Times New Roman"/>
+          <w:sz w:val="24"/>
+        </w:rPr>
+        <w:t>Scattering</w:t>
+      </w:r>
+      <w:proofErr w:type="spellEnd"/>
+      <w:r>
+        <w:rPr>
+          <w:rFonts w:ascii="Times New Roman" w:hAnsi="Times New Roman" w:cs="Times New Roman"/>
+          <w:sz w:val="24"/>
+        </w:rPr>
+        <w:t xml:space="preserve"> </w:t>
+      </w:r>
+      <w:proofErr w:type="spellStart"/>
+      <w:r>
+        <w:rPr>
+          <w:rFonts w:ascii="Times New Roman" w:hAnsi="Times New Roman" w:cs="Times New Roman"/>
+          <w:sz w:val="24"/>
+        </w:rPr>
+        <w:t>of</w:t>
+      </w:r>
+      <w:proofErr w:type="spellEnd"/>
+      <w:r>
+        <w:rPr>
+          <w:rFonts w:ascii="Times New Roman" w:hAnsi="Times New Roman" w:cs="Times New Roman"/>
+          <w:sz w:val="24"/>
+        </w:rPr>
+        <w:t xml:space="preserve"> X-</w:t>
+      </w:r>
+      <w:proofErr w:type="spellStart"/>
+      <w:r>
+        <w:rPr>
+          <w:rFonts w:ascii="Times New Roman" w:hAnsi="Times New Roman" w:cs="Times New Roman"/>
+          <w:sz w:val="24"/>
+        </w:rPr>
+        <w:t>ray</w:t>
+      </w:r>
+      <w:proofErr w:type="spellEnd"/>
+      <w:r>
+        <w:rPr>
+          <w:rFonts w:ascii="Times New Roman" w:hAnsi="Times New Roman" w:cs="Times New Roman"/>
+          <w:sz w:val="24"/>
+        </w:rPr>
+        <w:t xml:space="preserve"> </w:t>
+      </w:r>
+      <w:proofErr w:type="spellStart"/>
+      <w:r>
+        <w:rPr>
+          <w:rFonts w:ascii="Times New Roman" w:hAnsi="Times New Roman" w:cs="Times New Roman"/>
+          <w:sz w:val="24"/>
+        </w:rPr>
+        <w:t>Ultrashort</w:t>
+      </w:r>
+      <w:proofErr w:type="spellEnd"/>
+      <w:r>
+        <w:rPr>
+          <w:rFonts w:ascii="Times New Roman" w:hAnsi="Times New Roman" w:cs="Times New Roman"/>
+          <w:sz w:val="24"/>
+        </w:rPr>
+        <w:t xml:space="preserve"> Laser </w:t>
+      </w:r>
+      <w:proofErr w:type="spellStart"/>
+      <w:r>
+        <w:rPr>
+          <w:rFonts w:ascii="Times New Roman" w:hAnsi="Times New Roman" w:cs="Times New Roman"/>
+          <w:sz w:val="24"/>
+        </w:rPr>
+        <w:t>Pulses</w:t>
+      </w:r>
+      <w:proofErr w:type="spellEnd"/>
+      <w:r>
+        <w:rPr>
+          <w:rFonts w:ascii="Times New Roman" w:hAnsi="Times New Roman" w:cs="Times New Roman"/>
+          <w:sz w:val="24"/>
+        </w:rPr>
+        <w:t xml:space="preserve"> on </w:t>
+      </w:r>
+      <w:proofErr w:type="spellStart"/>
+      <w:r>
+        <w:rPr>
+          <w:rFonts w:ascii="Times New Roman" w:hAnsi="Times New Roman" w:cs="Times New Roman"/>
+          <w:sz w:val="24"/>
+        </w:rPr>
+        <w:t>Bound</w:t>
+      </w:r>
+      <w:proofErr w:type="spellEnd"/>
+      <w:r>
+        <w:rPr>
+          <w:rFonts w:ascii="Times New Roman" w:hAnsi="Times New Roman" w:cs="Times New Roman"/>
+          <w:sz w:val="24"/>
+        </w:rPr>
+        <w:t xml:space="preserve"> </w:t>
+      </w:r>
+      <w:proofErr w:type="spellStart"/>
+      <w:r>
+        <w:rPr>
+          <w:rFonts w:ascii="Times New Roman" w:hAnsi="Times New Roman" w:cs="Times New Roman"/>
+          <w:sz w:val="24"/>
+        </w:rPr>
+        <w:t>Electrons</w:t>
+      </w:r>
+      <w:proofErr w:type="spellEnd"/>
+      <w:r>
+        <w:rPr>
+          <w:rFonts w:ascii="Times New Roman" w:hAnsi="Times New Roman" w:cs="Times New Roman"/>
+          <w:sz w:val="24"/>
+        </w:rPr>
+        <w:t xml:space="preserve"> in </w:t>
+      </w:r>
+      <w:proofErr w:type="spellStart"/>
+      <w:r>
+        <w:rPr>
+          <w:rFonts w:ascii="Times New Roman" w:hAnsi="Times New Roman" w:cs="Times New Roman"/>
+          <w:sz w:val="24"/>
+        </w:rPr>
+        <w:t>Dense</w:t>
+      </w:r>
+      <w:proofErr w:type="spellEnd"/>
+      <w:r>
+        <w:rPr>
+          <w:rFonts w:ascii="Times New Roman" w:hAnsi="Times New Roman" w:cs="Times New Roman"/>
+          <w:sz w:val="24"/>
+        </w:rPr>
+        <w:t xml:space="preserve"> </w:t>
+      </w:r>
+      <w:proofErr w:type="spellStart"/>
+      <w:r>
+        <w:rPr>
+          <w:rFonts w:ascii="Times New Roman" w:hAnsi="Times New Roman" w:cs="Times New Roman"/>
+          <w:sz w:val="24"/>
+        </w:rPr>
+        <w:t>Plasma</w:t>
+      </w:r>
+      <w:proofErr w:type="spellEnd"/>
+      <w:r>
+        <w:rPr>
+          <w:rFonts w:ascii="Times New Roman" w:hAnsi="Times New Roman" w:cs="Times New Roman"/>
+          <w:sz w:val="24"/>
+        </w:rPr>
+        <w:t xml:space="preserve"> // </w:t>
+      </w:r>
+      <w:proofErr w:type="spellStart"/>
+      <w:r>
+        <w:rPr>
+          <w:rFonts w:ascii="Times New Roman" w:hAnsi="Times New Roman" w:cs="Times New Roman"/>
+          <w:sz w:val="24"/>
+        </w:rPr>
+        <w:t>Atoms</w:t>
+      </w:r>
+      <w:proofErr w:type="spellEnd"/>
+      <w:r>
+        <w:rPr>
+          <w:rFonts w:ascii="Times New Roman" w:hAnsi="Times New Roman" w:cs="Times New Roman"/>
+          <w:sz w:val="24"/>
+        </w:rPr>
+        <w:t xml:space="preserve">. – 2023. – V. 11. – No. 6. – P. 100. DOI: 10.3390/atoms11060100 </w:t>
       </w:r>
     </w:p>
     <w:p>
@@ -1174,12 +3008,246 @@
           <w:sz w:val="24"/>
         </w:rPr>
       </w:pPr>
-      <w:r>
-        <w:rPr>
-          <w:rFonts w:ascii="Times New Roman" w:hAnsi="Times New Roman" w:cs="Times New Roman"/>
-          <w:sz w:val="24"/>
-        </w:rPr>
-        <w:t xml:space="preserve">Astapenko V. A., Bergaliyev T. K., Sakhno S. V. Excitation of phonons by electromagnetic pulses in view of propagation effects in the medium // Applied Physics B. – 2024. – V. 130. – No. 11. – P. 208. DOI: 10.1007/s00340-024-08347-1 </w:t>
+      <w:proofErr w:type="spellStart"/>
+      <w:r>
+        <w:rPr>
+          <w:rFonts w:ascii="Times New Roman" w:hAnsi="Times New Roman" w:cs="Times New Roman"/>
+          <w:sz w:val="24"/>
+        </w:rPr>
+        <w:lastRenderedPageBreak/>
+        <w:t>Astapenko</w:t>
+      </w:r>
+      <w:proofErr w:type="spellEnd"/>
+      <w:r>
+        <w:rPr>
+          <w:rFonts w:ascii="Times New Roman" w:hAnsi="Times New Roman" w:cs="Times New Roman"/>
+          <w:sz w:val="24"/>
+        </w:rPr>
+        <w:t xml:space="preserve"> V. A., </w:t>
+      </w:r>
+      <w:proofErr w:type="spellStart"/>
+      <w:r>
+        <w:rPr>
+          <w:rFonts w:ascii="Times New Roman" w:hAnsi="Times New Roman" w:cs="Times New Roman"/>
+          <w:sz w:val="24"/>
+        </w:rPr>
+        <w:t>Bergaliyev</w:t>
+      </w:r>
+      <w:proofErr w:type="spellEnd"/>
+      <w:r>
+        <w:rPr>
+          <w:rFonts w:ascii="Times New Roman" w:hAnsi="Times New Roman" w:cs="Times New Roman"/>
+          <w:sz w:val="24"/>
+        </w:rPr>
+        <w:t xml:space="preserve"> T. K., </w:t>
+      </w:r>
+      <w:proofErr w:type="spellStart"/>
+      <w:r>
+        <w:rPr>
+          <w:rFonts w:ascii="Times New Roman" w:hAnsi="Times New Roman" w:cs="Times New Roman"/>
+          <w:sz w:val="24"/>
+        </w:rPr>
+        <w:t>Sakhno</w:t>
+      </w:r>
+      <w:proofErr w:type="spellEnd"/>
+      <w:r>
+        <w:rPr>
+          <w:rFonts w:ascii="Times New Roman" w:hAnsi="Times New Roman" w:cs="Times New Roman"/>
+          <w:sz w:val="24"/>
+        </w:rPr>
+        <w:t xml:space="preserve"> S. V. </w:t>
+      </w:r>
+      <w:proofErr w:type="spellStart"/>
+      <w:r>
+        <w:rPr>
+          <w:rFonts w:ascii="Times New Roman" w:hAnsi="Times New Roman" w:cs="Times New Roman"/>
+          <w:sz w:val="24"/>
+        </w:rPr>
+        <w:t>Excitation</w:t>
+      </w:r>
+      <w:proofErr w:type="spellEnd"/>
+      <w:r>
+        <w:rPr>
+          <w:rFonts w:ascii="Times New Roman" w:hAnsi="Times New Roman" w:cs="Times New Roman"/>
+          <w:sz w:val="24"/>
+        </w:rPr>
+        <w:t xml:space="preserve"> </w:t>
+      </w:r>
+      <w:proofErr w:type="spellStart"/>
+      <w:r>
+        <w:rPr>
+          <w:rFonts w:ascii="Times New Roman" w:hAnsi="Times New Roman" w:cs="Times New Roman"/>
+          <w:sz w:val="24"/>
+        </w:rPr>
+        <w:t>of</w:t>
+      </w:r>
+      <w:proofErr w:type="spellEnd"/>
+      <w:r>
+        <w:rPr>
+          <w:rFonts w:ascii="Times New Roman" w:hAnsi="Times New Roman" w:cs="Times New Roman"/>
+          <w:sz w:val="24"/>
+        </w:rPr>
+        <w:t xml:space="preserve"> </w:t>
+      </w:r>
+      <w:proofErr w:type="spellStart"/>
+      <w:r>
+        <w:rPr>
+          <w:rFonts w:ascii="Times New Roman" w:hAnsi="Times New Roman" w:cs="Times New Roman"/>
+          <w:sz w:val="24"/>
+        </w:rPr>
+        <w:t>phonons</w:t>
+      </w:r>
+      <w:proofErr w:type="spellEnd"/>
+      <w:r>
+        <w:rPr>
+          <w:rFonts w:ascii="Times New Roman" w:hAnsi="Times New Roman" w:cs="Times New Roman"/>
+          <w:sz w:val="24"/>
+        </w:rPr>
+        <w:t xml:space="preserve"> </w:t>
+      </w:r>
+      <w:proofErr w:type="spellStart"/>
+      <w:r>
+        <w:rPr>
+          <w:rFonts w:ascii="Times New Roman" w:hAnsi="Times New Roman" w:cs="Times New Roman"/>
+          <w:sz w:val="24"/>
+        </w:rPr>
+        <w:t>by</w:t>
+      </w:r>
+      <w:proofErr w:type="spellEnd"/>
+      <w:r>
+        <w:rPr>
+          <w:rFonts w:ascii="Times New Roman" w:hAnsi="Times New Roman" w:cs="Times New Roman"/>
+          <w:sz w:val="24"/>
+        </w:rPr>
+        <w:t xml:space="preserve"> </w:t>
+      </w:r>
+      <w:proofErr w:type="spellStart"/>
+      <w:r>
+        <w:rPr>
+          <w:rFonts w:ascii="Times New Roman" w:hAnsi="Times New Roman" w:cs="Times New Roman"/>
+          <w:sz w:val="24"/>
+        </w:rPr>
+        <w:t>electromagnetic</w:t>
+      </w:r>
+      <w:proofErr w:type="spellEnd"/>
+      <w:r>
+        <w:rPr>
+          <w:rFonts w:ascii="Times New Roman" w:hAnsi="Times New Roman" w:cs="Times New Roman"/>
+          <w:sz w:val="24"/>
+        </w:rPr>
+        <w:t xml:space="preserve"> </w:t>
+      </w:r>
+      <w:proofErr w:type="spellStart"/>
+      <w:r>
+        <w:rPr>
+          <w:rFonts w:ascii="Times New Roman" w:hAnsi="Times New Roman" w:cs="Times New Roman"/>
+          <w:sz w:val="24"/>
+        </w:rPr>
+        <w:t>pulses</w:t>
+      </w:r>
+      <w:proofErr w:type="spellEnd"/>
+      <w:r>
+        <w:rPr>
+          <w:rFonts w:ascii="Times New Roman" w:hAnsi="Times New Roman" w:cs="Times New Roman"/>
+          <w:sz w:val="24"/>
+        </w:rPr>
+        <w:t xml:space="preserve"> in </w:t>
+      </w:r>
+      <w:proofErr w:type="spellStart"/>
+      <w:r>
+        <w:rPr>
+          <w:rFonts w:ascii="Times New Roman" w:hAnsi="Times New Roman" w:cs="Times New Roman"/>
+          <w:sz w:val="24"/>
+        </w:rPr>
+        <w:t>view</w:t>
+      </w:r>
+      <w:proofErr w:type="spellEnd"/>
+      <w:r>
+        <w:rPr>
+          <w:rFonts w:ascii="Times New Roman" w:hAnsi="Times New Roman" w:cs="Times New Roman"/>
+          <w:sz w:val="24"/>
+        </w:rPr>
+        <w:t xml:space="preserve"> </w:t>
+      </w:r>
+      <w:proofErr w:type="spellStart"/>
+      <w:r>
+        <w:rPr>
+          <w:rFonts w:ascii="Times New Roman" w:hAnsi="Times New Roman" w:cs="Times New Roman"/>
+          <w:sz w:val="24"/>
+        </w:rPr>
+        <w:t>of</w:t>
+      </w:r>
+      <w:proofErr w:type="spellEnd"/>
+      <w:r>
+        <w:rPr>
+          <w:rFonts w:ascii="Times New Roman" w:hAnsi="Times New Roman" w:cs="Times New Roman"/>
+          <w:sz w:val="24"/>
+        </w:rPr>
+        <w:t xml:space="preserve"> </w:t>
+      </w:r>
+      <w:proofErr w:type="spellStart"/>
+      <w:r>
+        <w:rPr>
+          <w:rFonts w:ascii="Times New Roman" w:hAnsi="Times New Roman" w:cs="Times New Roman"/>
+          <w:sz w:val="24"/>
+        </w:rPr>
+        <w:t>propagation</w:t>
+      </w:r>
+      <w:proofErr w:type="spellEnd"/>
+      <w:r>
+        <w:rPr>
+          <w:rFonts w:ascii="Times New Roman" w:hAnsi="Times New Roman" w:cs="Times New Roman"/>
+          <w:sz w:val="24"/>
+        </w:rPr>
+        <w:t xml:space="preserve"> </w:t>
+      </w:r>
+      <w:proofErr w:type="spellStart"/>
+      <w:r>
+        <w:rPr>
+          <w:rFonts w:ascii="Times New Roman" w:hAnsi="Times New Roman" w:cs="Times New Roman"/>
+          <w:sz w:val="24"/>
+        </w:rPr>
+        <w:t>effects</w:t>
+      </w:r>
+      <w:proofErr w:type="spellEnd"/>
+      <w:r>
+        <w:rPr>
+          <w:rFonts w:ascii="Times New Roman" w:hAnsi="Times New Roman" w:cs="Times New Roman"/>
+          <w:sz w:val="24"/>
+        </w:rPr>
+        <w:t xml:space="preserve"> in </w:t>
+      </w:r>
+      <w:proofErr w:type="spellStart"/>
+      <w:r>
+        <w:rPr>
+          <w:rFonts w:ascii="Times New Roman" w:hAnsi="Times New Roman" w:cs="Times New Roman"/>
+          <w:sz w:val="24"/>
+        </w:rPr>
+        <w:t>the</w:t>
+      </w:r>
+      <w:proofErr w:type="spellEnd"/>
+      <w:r>
+        <w:rPr>
+          <w:rFonts w:ascii="Times New Roman" w:hAnsi="Times New Roman" w:cs="Times New Roman"/>
+          <w:sz w:val="24"/>
+        </w:rPr>
+        <w:t xml:space="preserve"> </w:t>
+      </w:r>
+      <w:proofErr w:type="spellStart"/>
+      <w:r>
+        <w:rPr>
+          <w:rFonts w:ascii="Times New Roman" w:hAnsi="Times New Roman" w:cs="Times New Roman"/>
+          <w:sz w:val="24"/>
+        </w:rPr>
+        <w:t>medium</w:t>
+      </w:r>
+      <w:proofErr w:type="spellEnd"/>
+      <w:r>
+        <w:rPr>
+          <w:rFonts w:ascii="Times New Roman" w:hAnsi="Times New Roman" w:cs="Times New Roman"/>
+          <w:sz w:val="24"/>
+        </w:rPr>
+        <w:t xml:space="preserve"> // Applied Physics B. – 2024. – V. 130. – No. 11. – P. 208. DOI: 10.1007/s00340-024-08347-1 </w:t>
       </w:r>
     </w:p>
     <w:p>
@@ -1195,13 +3263,293 @@
           <w:sz w:val="24"/>
         </w:rPr>
       </w:pPr>
-      <w:r>
-        <w:rPr>
-          <w:rFonts w:ascii="Times New Roman" w:hAnsi="Times New Roman" w:cs="Times New Roman"/>
-          <w:sz w:val="24"/>
-        </w:rPr>
-        <w:lastRenderedPageBreak/>
-        <w:t>Astapenko V. A., Sakhno E. V., Sakhno S. V. The induced bremsstrahlung effect in the field of laser pulses in electron scattering by a multiply charged ion with a core // Physics of Plasmas. – 2025. – V. 32. – No. 10. DOI: 10.1063/5.0258672</w:t>
+      <w:proofErr w:type="spellStart"/>
+      <w:r>
+        <w:rPr>
+          <w:rFonts w:ascii="Times New Roman" w:hAnsi="Times New Roman" w:cs="Times New Roman"/>
+          <w:sz w:val="24"/>
+        </w:rPr>
+        <w:t>Astapenko</w:t>
+      </w:r>
+      <w:proofErr w:type="spellEnd"/>
+      <w:r>
+        <w:rPr>
+          <w:rFonts w:ascii="Times New Roman" w:hAnsi="Times New Roman" w:cs="Times New Roman"/>
+          <w:sz w:val="24"/>
+        </w:rPr>
+        <w:t xml:space="preserve"> V. A., </w:t>
+      </w:r>
+      <w:proofErr w:type="spellStart"/>
+      <w:r>
+        <w:rPr>
+          <w:rFonts w:ascii="Times New Roman" w:hAnsi="Times New Roman" w:cs="Times New Roman"/>
+          <w:sz w:val="24"/>
+        </w:rPr>
+        <w:t>Sakhno</w:t>
+      </w:r>
+      <w:proofErr w:type="spellEnd"/>
+      <w:r>
+        <w:rPr>
+          <w:rFonts w:ascii="Times New Roman" w:hAnsi="Times New Roman" w:cs="Times New Roman"/>
+          <w:sz w:val="24"/>
+        </w:rPr>
+        <w:t xml:space="preserve"> E. V., </w:t>
+      </w:r>
+      <w:proofErr w:type="spellStart"/>
+      <w:r>
+        <w:rPr>
+          <w:rFonts w:ascii="Times New Roman" w:hAnsi="Times New Roman" w:cs="Times New Roman"/>
+          <w:sz w:val="24"/>
+        </w:rPr>
+        <w:t>Sakhno</w:t>
+      </w:r>
+      <w:proofErr w:type="spellEnd"/>
+      <w:r>
+        <w:rPr>
+          <w:rFonts w:ascii="Times New Roman" w:hAnsi="Times New Roman" w:cs="Times New Roman"/>
+          <w:sz w:val="24"/>
+        </w:rPr>
+        <w:t xml:space="preserve"> S. V. The induced </w:t>
+      </w:r>
+      <w:proofErr w:type="spellStart"/>
+      <w:r>
+        <w:rPr>
+          <w:rFonts w:ascii="Times New Roman" w:hAnsi="Times New Roman" w:cs="Times New Roman"/>
+          <w:sz w:val="24"/>
+        </w:rPr>
+        <w:t>bremsstrahlung</w:t>
+      </w:r>
+      <w:proofErr w:type="spellEnd"/>
+      <w:r>
+        <w:rPr>
+          <w:rFonts w:ascii="Times New Roman" w:hAnsi="Times New Roman" w:cs="Times New Roman"/>
+          <w:sz w:val="24"/>
+        </w:rPr>
+        <w:t xml:space="preserve"> effect in </w:t>
+      </w:r>
+      <w:proofErr w:type="spellStart"/>
+      <w:r>
+        <w:rPr>
+          <w:rFonts w:ascii="Times New Roman" w:hAnsi="Times New Roman" w:cs="Times New Roman"/>
+          <w:sz w:val="24"/>
+        </w:rPr>
+        <w:t>the</w:t>
+      </w:r>
+      <w:proofErr w:type="spellEnd"/>
+      <w:r>
+        <w:rPr>
+          <w:rFonts w:ascii="Times New Roman" w:hAnsi="Times New Roman" w:cs="Times New Roman"/>
+          <w:sz w:val="24"/>
+        </w:rPr>
+        <w:t xml:space="preserve"> </w:t>
+      </w:r>
+      <w:proofErr w:type="spellStart"/>
+      <w:r>
+        <w:rPr>
+          <w:rFonts w:ascii="Times New Roman" w:hAnsi="Times New Roman" w:cs="Times New Roman"/>
+          <w:sz w:val="24"/>
+        </w:rPr>
+        <w:t>field</w:t>
+      </w:r>
+      <w:proofErr w:type="spellEnd"/>
+      <w:r>
+        <w:rPr>
+          <w:rFonts w:ascii="Times New Roman" w:hAnsi="Times New Roman" w:cs="Times New Roman"/>
+          <w:sz w:val="24"/>
+        </w:rPr>
+        <w:t xml:space="preserve"> </w:t>
+      </w:r>
+      <w:proofErr w:type="spellStart"/>
+      <w:r>
+        <w:rPr>
+          <w:rFonts w:ascii="Times New Roman" w:hAnsi="Times New Roman" w:cs="Times New Roman"/>
+          <w:sz w:val="24"/>
+        </w:rPr>
+        <w:t>of</w:t>
+      </w:r>
+      <w:proofErr w:type="spellEnd"/>
+      <w:r>
+        <w:rPr>
+          <w:rFonts w:ascii="Times New Roman" w:hAnsi="Times New Roman" w:cs="Times New Roman"/>
+          <w:sz w:val="24"/>
+        </w:rPr>
+        <w:t xml:space="preserve"> laser </w:t>
+      </w:r>
+      <w:proofErr w:type="spellStart"/>
+      <w:r>
+        <w:rPr>
+          <w:rFonts w:ascii="Times New Roman" w:hAnsi="Times New Roman" w:cs="Times New Roman"/>
+          <w:sz w:val="24"/>
+        </w:rPr>
+        <w:t>pulses</w:t>
+      </w:r>
+      <w:proofErr w:type="spellEnd"/>
+      <w:r>
+        <w:rPr>
+          <w:rFonts w:ascii="Times New Roman" w:hAnsi="Times New Roman" w:cs="Times New Roman"/>
+          <w:sz w:val="24"/>
+        </w:rPr>
+        <w:t xml:space="preserve"> in </w:t>
+      </w:r>
+      <w:proofErr w:type="spellStart"/>
+      <w:r>
+        <w:rPr>
+          <w:rFonts w:ascii="Times New Roman" w:hAnsi="Times New Roman" w:cs="Times New Roman"/>
+          <w:sz w:val="24"/>
+        </w:rPr>
+        <w:t>electron</w:t>
+      </w:r>
+      <w:proofErr w:type="spellEnd"/>
+      <w:r>
+        <w:rPr>
+          <w:rFonts w:ascii="Times New Roman" w:hAnsi="Times New Roman" w:cs="Times New Roman"/>
+          <w:sz w:val="24"/>
+        </w:rPr>
+        <w:t xml:space="preserve"> </w:t>
+      </w:r>
+      <w:proofErr w:type="spellStart"/>
+      <w:r>
+        <w:rPr>
+          <w:rFonts w:ascii="Times New Roman" w:hAnsi="Times New Roman" w:cs="Times New Roman"/>
+          <w:sz w:val="24"/>
+        </w:rPr>
+        <w:t>scattering</w:t>
+      </w:r>
+      <w:proofErr w:type="spellEnd"/>
+      <w:r>
+        <w:rPr>
+          <w:rFonts w:ascii="Times New Roman" w:hAnsi="Times New Roman" w:cs="Times New Roman"/>
+          <w:sz w:val="24"/>
+        </w:rPr>
+        <w:t xml:space="preserve"> </w:t>
+      </w:r>
+      <w:proofErr w:type="spellStart"/>
+      <w:r>
+        <w:rPr>
+          <w:rFonts w:ascii="Times New Roman" w:hAnsi="Times New Roman" w:cs="Times New Roman"/>
+          <w:sz w:val="24"/>
+        </w:rPr>
+        <w:t>by</w:t>
+      </w:r>
+      <w:proofErr w:type="spellEnd"/>
+      <w:r>
+        <w:rPr>
+          <w:rFonts w:ascii="Times New Roman" w:hAnsi="Times New Roman" w:cs="Times New Roman"/>
+          <w:sz w:val="24"/>
+        </w:rPr>
+        <w:t xml:space="preserve"> a </w:t>
+      </w:r>
+      <w:proofErr w:type="spellStart"/>
+      <w:r>
+        <w:rPr>
+          <w:rFonts w:ascii="Times New Roman" w:hAnsi="Times New Roman" w:cs="Times New Roman"/>
+          <w:sz w:val="24"/>
+        </w:rPr>
+        <w:t>multiply</w:t>
+      </w:r>
+      <w:proofErr w:type="spellEnd"/>
+      <w:r>
+        <w:rPr>
+          <w:rFonts w:ascii="Times New Roman" w:hAnsi="Times New Roman" w:cs="Times New Roman"/>
+          <w:sz w:val="24"/>
+        </w:rPr>
+        <w:t xml:space="preserve"> </w:t>
+      </w:r>
+      <w:proofErr w:type="spellStart"/>
+      <w:r>
+        <w:rPr>
+          <w:rFonts w:ascii="Times New Roman" w:hAnsi="Times New Roman" w:cs="Times New Roman"/>
+          <w:sz w:val="24"/>
+        </w:rPr>
+        <w:t>charged</w:t>
+      </w:r>
+      <w:proofErr w:type="spellEnd"/>
+      <w:r>
+        <w:rPr>
+          <w:rFonts w:ascii="Times New Roman" w:hAnsi="Times New Roman" w:cs="Times New Roman"/>
+          <w:sz w:val="24"/>
+        </w:rPr>
+        <w:t xml:space="preserve"> </w:t>
+      </w:r>
+      <w:proofErr w:type="spellStart"/>
+      <w:r>
+        <w:rPr>
+          <w:rFonts w:ascii="Times New Roman" w:hAnsi="Times New Roman" w:cs="Times New Roman"/>
+          <w:sz w:val="24"/>
+        </w:rPr>
+        <w:t>ion</w:t>
+      </w:r>
+      <w:proofErr w:type="spellEnd"/>
+      <w:r>
+        <w:rPr>
+          <w:rFonts w:ascii="Times New Roman" w:hAnsi="Times New Roman" w:cs="Times New Roman"/>
+          <w:sz w:val="24"/>
+        </w:rPr>
+        <w:t xml:space="preserve"> </w:t>
+      </w:r>
+      <w:proofErr w:type="spellStart"/>
+      <w:r>
+        <w:rPr>
+          <w:rFonts w:ascii="Times New Roman" w:hAnsi="Times New Roman" w:cs="Times New Roman"/>
+          <w:sz w:val="24"/>
+        </w:rPr>
+        <w:t>with</w:t>
+      </w:r>
+      <w:proofErr w:type="spellEnd"/>
+      <w:r>
+        <w:rPr>
+          <w:rFonts w:ascii="Times New Roman" w:hAnsi="Times New Roman" w:cs="Times New Roman"/>
+          <w:sz w:val="24"/>
+        </w:rPr>
+        <w:t xml:space="preserve"> a </w:t>
+      </w:r>
+      <w:proofErr w:type="spellStart"/>
+      <w:r>
+        <w:rPr>
+          <w:rFonts w:ascii="Times New Roman" w:hAnsi="Times New Roman" w:cs="Times New Roman"/>
+          <w:sz w:val="24"/>
+        </w:rPr>
+        <w:t>core</w:t>
+      </w:r>
+      <w:proofErr w:type="spellEnd"/>
+      <w:r>
+        <w:rPr>
+          <w:rFonts w:ascii="Times New Roman" w:hAnsi="Times New Roman" w:cs="Times New Roman"/>
+          <w:sz w:val="24"/>
+        </w:rPr>
+        <w:t xml:space="preserve"> // Physics </w:t>
+      </w:r>
+      <w:proofErr w:type="spellStart"/>
+      <w:r>
+        <w:rPr>
+          <w:rFonts w:ascii="Times New Roman" w:hAnsi="Times New Roman" w:cs="Times New Roman"/>
+          <w:sz w:val="24"/>
+        </w:rPr>
+        <w:t>of</w:t>
+      </w:r>
+      <w:proofErr w:type="spellEnd"/>
+      <w:r>
+        <w:rPr>
+          <w:rFonts w:ascii="Times New Roman" w:hAnsi="Times New Roman" w:cs="Times New Roman"/>
+          <w:sz w:val="24"/>
+        </w:rPr>
+        <w:t xml:space="preserve"> </w:t>
+      </w:r>
+      <w:proofErr w:type="spellStart"/>
+      <w:r>
+        <w:rPr>
+          <w:rFonts w:ascii="Times New Roman" w:hAnsi="Times New Roman" w:cs="Times New Roman"/>
+          <w:sz w:val="24"/>
+        </w:rPr>
+        <w:t>Plasmas</w:t>
+      </w:r>
+      <w:proofErr w:type="spellEnd"/>
+      <w:r>
+        <w:rPr>
+          <w:rFonts w:ascii="Times New Roman" w:hAnsi="Times New Roman" w:cs="Times New Roman"/>
+          <w:sz w:val="24"/>
+        </w:rPr>
+        <w:t>. – 2025. – V. 32. – No. 10. DOI: 10.1063/5.0258672</w:t>
       </w:r>
     </w:p>
     <w:p>
@@ -1217,12 +3565,197 @@
           <w:sz w:val="24"/>
         </w:rPr>
       </w:pPr>
-      <w:r>
-        <w:rPr>
-          <w:rFonts w:ascii="Times New Roman" w:hAnsi="Times New Roman" w:cs="Times New Roman"/>
-          <w:sz w:val="24"/>
-        </w:rPr>
-        <w:t>Astapenko V. A. Absorption of ultrashort laser pulses in medium with account for propagation effects // Journal of Optics. – 2024. – V. 26. – No. 9. – P. 095402. DOI: 10.1088/2040-8986/ad67b3</w:t>
+      <w:proofErr w:type="spellStart"/>
+      <w:r>
+        <w:rPr>
+          <w:rFonts w:ascii="Times New Roman" w:hAnsi="Times New Roman" w:cs="Times New Roman"/>
+          <w:sz w:val="24"/>
+        </w:rPr>
+        <w:t>Astapenko</w:t>
+      </w:r>
+      <w:proofErr w:type="spellEnd"/>
+      <w:r>
+        <w:rPr>
+          <w:rFonts w:ascii="Times New Roman" w:hAnsi="Times New Roman" w:cs="Times New Roman"/>
+          <w:sz w:val="24"/>
+        </w:rPr>
+        <w:t xml:space="preserve"> V. A. </w:t>
+      </w:r>
+      <w:proofErr w:type="spellStart"/>
+      <w:r>
+        <w:rPr>
+          <w:rFonts w:ascii="Times New Roman" w:hAnsi="Times New Roman" w:cs="Times New Roman"/>
+          <w:sz w:val="24"/>
+        </w:rPr>
+        <w:t>Absorption</w:t>
+      </w:r>
+      <w:proofErr w:type="spellEnd"/>
+      <w:r>
+        <w:rPr>
+          <w:rFonts w:ascii="Times New Roman" w:hAnsi="Times New Roman" w:cs="Times New Roman"/>
+          <w:sz w:val="24"/>
+        </w:rPr>
+        <w:t xml:space="preserve"> </w:t>
+      </w:r>
+      <w:proofErr w:type="spellStart"/>
+      <w:r>
+        <w:rPr>
+          <w:rFonts w:ascii="Times New Roman" w:hAnsi="Times New Roman" w:cs="Times New Roman"/>
+          <w:sz w:val="24"/>
+        </w:rPr>
+        <w:t>of</w:t>
+      </w:r>
+      <w:proofErr w:type="spellEnd"/>
+      <w:r>
+        <w:rPr>
+          <w:rFonts w:ascii="Times New Roman" w:hAnsi="Times New Roman" w:cs="Times New Roman"/>
+          <w:sz w:val="24"/>
+        </w:rPr>
+        <w:t xml:space="preserve"> </w:t>
+      </w:r>
+      <w:proofErr w:type="spellStart"/>
+      <w:r>
+        <w:rPr>
+          <w:rFonts w:ascii="Times New Roman" w:hAnsi="Times New Roman" w:cs="Times New Roman"/>
+          <w:sz w:val="24"/>
+        </w:rPr>
+        <w:t>ultrashort</w:t>
+      </w:r>
+      <w:proofErr w:type="spellEnd"/>
+      <w:r>
+        <w:rPr>
+          <w:rFonts w:ascii="Times New Roman" w:hAnsi="Times New Roman" w:cs="Times New Roman"/>
+          <w:sz w:val="24"/>
+        </w:rPr>
+        <w:t xml:space="preserve"> laser </w:t>
+      </w:r>
+      <w:proofErr w:type="spellStart"/>
+      <w:r>
+        <w:rPr>
+          <w:rFonts w:ascii="Times New Roman" w:hAnsi="Times New Roman" w:cs="Times New Roman"/>
+          <w:sz w:val="24"/>
+        </w:rPr>
+        <w:t>pulses</w:t>
+      </w:r>
+      <w:proofErr w:type="spellEnd"/>
+      <w:r>
+        <w:rPr>
+          <w:rFonts w:ascii="Times New Roman" w:hAnsi="Times New Roman" w:cs="Times New Roman"/>
+          <w:sz w:val="24"/>
+        </w:rPr>
+        <w:t xml:space="preserve"> in </w:t>
+      </w:r>
+      <w:proofErr w:type="spellStart"/>
+      <w:r>
+        <w:rPr>
+          <w:rFonts w:ascii="Times New Roman" w:hAnsi="Times New Roman" w:cs="Times New Roman"/>
+          <w:sz w:val="24"/>
+        </w:rPr>
+        <w:t>medium</w:t>
+      </w:r>
+      <w:proofErr w:type="spellEnd"/>
+      <w:r>
+        <w:rPr>
+          <w:rFonts w:ascii="Times New Roman" w:hAnsi="Times New Roman" w:cs="Times New Roman"/>
+          <w:sz w:val="24"/>
+        </w:rPr>
+        <w:t xml:space="preserve"> </w:t>
+      </w:r>
+      <w:proofErr w:type="spellStart"/>
+      <w:r>
+        <w:rPr>
+          <w:rFonts w:ascii="Times New Roman" w:hAnsi="Times New Roman" w:cs="Times New Roman"/>
+          <w:sz w:val="24"/>
+        </w:rPr>
+        <w:t>with</w:t>
+      </w:r>
+      <w:proofErr w:type="spellEnd"/>
+      <w:r>
+        <w:rPr>
+          <w:rFonts w:ascii="Times New Roman" w:hAnsi="Times New Roman" w:cs="Times New Roman"/>
+          <w:sz w:val="24"/>
+        </w:rPr>
+        <w:t xml:space="preserve"> </w:t>
+      </w:r>
+      <w:proofErr w:type="spellStart"/>
+      <w:r>
+        <w:rPr>
+          <w:rFonts w:ascii="Times New Roman" w:hAnsi="Times New Roman" w:cs="Times New Roman"/>
+          <w:sz w:val="24"/>
+        </w:rPr>
+        <w:t>account</w:t>
+      </w:r>
+      <w:proofErr w:type="spellEnd"/>
+      <w:r>
+        <w:rPr>
+          <w:rFonts w:ascii="Times New Roman" w:hAnsi="Times New Roman" w:cs="Times New Roman"/>
+          <w:sz w:val="24"/>
+        </w:rPr>
+        <w:t xml:space="preserve"> for </w:t>
+      </w:r>
+      <w:proofErr w:type="spellStart"/>
+      <w:r>
+        <w:rPr>
+          <w:rFonts w:ascii="Times New Roman" w:hAnsi="Times New Roman" w:cs="Times New Roman"/>
+          <w:sz w:val="24"/>
+        </w:rPr>
+        <w:t>propagation</w:t>
+      </w:r>
+      <w:proofErr w:type="spellEnd"/>
+      <w:r>
+        <w:rPr>
+          <w:rFonts w:ascii="Times New Roman" w:hAnsi="Times New Roman" w:cs="Times New Roman"/>
+          <w:sz w:val="24"/>
+        </w:rPr>
+        <w:t xml:space="preserve"> </w:t>
+      </w:r>
+      <w:proofErr w:type="spellStart"/>
+      <w:r>
+        <w:rPr>
+          <w:rFonts w:ascii="Times New Roman" w:hAnsi="Times New Roman" w:cs="Times New Roman"/>
+          <w:sz w:val="24"/>
+        </w:rPr>
+        <w:t>effects</w:t>
+      </w:r>
+      <w:proofErr w:type="spellEnd"/>
+      <w:r>
+        <w:rPr>
+          <w:rFonts w:ascii="Times New Roman" w:hAnsi="Times New Roman" w:cs="Times New Roman"/>
+          <w:sz w:val="24"/>
+        </w:rPr>
+        <w:t xml:space="preserve"> // Journal </w:t>
+      </w:r>
+      <w:proofErr w:type="spellStart"/>
+      <w:r>
+        <w:rPr>
+          <w:rFonts w:ascii="Times New Roman" w:hAnsi="Times New Roman" w:cs="Times New Roman"/>
+          <w:sz w:val="24"/>
+        </w:rPr>
+        <w:t>of</w:t>
+      </w:r>
+      <w:proofErr w:type="spellEnd"/>
+      <w:r>
+        <w:rPr>
+          <w:rFonts w:ascii="Times New Roman" w:hAnsi="Times New Roman" w:cs="Times New Roman"/>
+          <w:sz w:val="24"/>
+        </w:rPr>
+        <w:t xml:space="preserve"> Optics. – 2024. – V. 26. – No. 9. – P. 095402. DOI: 10.1088/</w:t>
+      </w:r>
+      <w:proofErr w:type="gramStart"/>
+      <w:r>
+        <w:rPr>
+          <w:rFonts w:ascii="Times New Roman" w:hAnsi="Times New Roman" w:cs="Times New Roman"/>
+          <w:sz w:val="24"/>
+        </w:rPr>
+        <w:t>2040-8986</w:t>
+      </w:r>
+      <w:proofErr w:type="gramEnd"/>
+      <w:r>
+        <w:rPr>
+          <w:rFonts w:ascii="Times New Roman" w:hAnsi="Times New Roman" w:cs="Times New Roman"/>
+          <w:sz w:val="24"/>
+        </w:rPr>
+        <w:t>/ad67b3</w:t>
       </w:r>
     </w:p>
     <w:p>
@@ -1259,7 +3792,27 @@
           <w:szCs w:val="24"/>
           <w:lang w:eastAsia="ru-RU"/>
         </w:rPr>
-        <w:t xml:space="preserve"> научным руководителем соискателя в отношении которого было принято решение о лишении ученой степени</w:t>
+        <w:t xml:space="preserve"> </w:t>
+      </w:r>
+      <w:proofErr w:type="gramStart"/>
+      <w:r>
+        <w:rPr>
+          <w:rFonts w:ascii="Times New Roman" w:eastAsia="Times New Roman" w:hAnsi="Times New Roman" w:cs="Times New Roman"/>
+          <w:sz w:val="24"/>
+          <w:szCs w:val="24"/>
+          <w:lang w:eastAsia="ru-RU"/>
+        </w:rPr>
+        <w:t>научным руководителем соискателя</w:t>
+      </w:r>
+      <w:proofErr w:type="gramEnd"/>
+      <w:r>
+        <w:rPr>
+          <w:rFonts w:ascii="Times New Roman" w:eastAsia="Times New Roman" w:hAnsi="Times New Roman" w:cs="Times New Roman"/>
+          <w:sz w:val="24"/>
+          <w:szCs w:val="24"/>
+          <w:lang w:eastAsia="ru-RU"/>
+        </w:rPr>
+        <w:t xml:space="preserve"> в отношении которого было принято решение о лишении ученой степени</w:t>
       </w:r>
       <w:r>
         <w:rPr>
@@ -1541,8 +4094,22 @@
           <w:szCs w:val="24"/>
           <w:lang w:eastAsia="ru-RU"/>
         </w:rPr>
-        <w:t>Астапенко В.А.</w:t>
-      </w:r>
+        <w:t xml:space="preserve">Астапенко </w:t>
+      </w:r>
+      <w:proofErr w:type="gramStart"/>
+      <w:r>
+        <w:rPr>
+          <w:rFonts w:ascii="Times New Roman" w:eastAsia="Times New Roman" w:hAnsi="Times New Roman" w:cs="Times New Roman"/>
+          <w:i/>
+          <w:iCs/>
+          <w:color w:val="000000"/>
+          <w:sz w:val="24"/>
+          <w:szCs w:val="24"/>
+          <w:lang w:eastAsia="ru-RU"/>
+        </w:rPr>
+        <w:t>В.А.</w:t>
+      </w:r>
+      <w:proofErr w:type="gramEnd"/>
     </w:p>
     <w:sectPr>
       <w:pgSz w:w="11906" w:h="16838"/>
@@ -2492,6 +5059,29 @@
       <w:lang w:val="en-US"/>
     </w:rPr>
   </w:style>
+  <w:style w:type="character" w:styleId="a7">
+    <w:name w:val="Hyperlink"/>
+    <w:basedOn w:val="a0"/>
+    <w:uiPriority w:val="99"/>
+    <w:unhideWhenUsed/>
+    <w:rsid w:val="00D54820"/>
+    <w:rPr>
+      <w:color w:val="0000FF" w:themeColor="hyperlink"/>
+      <w:u w:val="single"/>
+    </w:rPr>
+  </w:style>
+  <w:style w:type="character" w:styleId="a8">
+    <w:name w:val="Unresolved Mention"/>
+    <w:basedOn w:val="a0"/>
+    <w:uiPriority w:val="99"/>
+    <w:semiHidden/>
+    <w:unhideWhenUsed/>
+    <w:rsid w:val="00D54820"/>
+    <w:rPr>
+      <w:color w:val="605E5C"/>
+      <w:shd w:val="clear" w:color="auto" w:fill="E1DFDD"/>
+    </w:rPr>
+  </w:style>
 </w:styles>
 </file>
 

</xml_diff>